<commit_message>
Add LAB6 pfSense firewall configuration
</commit_message>
<xml_diff>
--- a/LAB5/11TMDT-LAB5_1150070015_NgoThanhHuu.docx
+++ b/LAB5/11TMDT-LAB5_1150070015_NgoThanhHuu.docx
@@ -53,18 +53,8 @@
           <w:bCs/>
           <w:sz w:val="26"/>
         </w:rPr>
-        <w:t xml:space="preserve">THIẾT LẬP MÔ HÌNH TƯỜNG LỬA </w:t>
-      </w:r>
-      <w:proofErr w:type="spellStart"/>
-      <w:r>
-        <w:rPr>
-          <w:b/>
-          <w:bCs/>
-          <w:sz w:val="26"/>
-        </w:rPr>
-        <w:t>pfSense</w:t>
-      </w:r>
-      <w:proofErr w:type="spellEnd"/>
+        <w:t>THIẾT LẬP MÔ HÌNH TƯỜNG LỬA pfSense</w:t>
+      </w:r>
     </w:p>
     <w:tbl>
       <w:tblPr>
@@ -269,21 +259,7 @@
         <w:rPr>
           <w:sz w:val="26"/>
         </w:rPr>
-        <w:t xml:space="preserve">Link </w:t>
-      </w:r>
-      <w:proofErr w:type="spellStart"/>
-      <w:r>
-        <w:rPr>
-          <w:sz w:val="26"/>
-        </w:rPr>
-        <w:t>youtobe</w:t>
-      </w:r>
-      <w:proofErr w:type="spellEnd"/>
-      <w:r>
-        <w:rPr>
-          <w:sz w:val="26"/>
-        </w:rPr>
-        <w:t xml:space="preserve"> : </w:t>
+        <w:t xml:space="preserve">Link youtobe : </w:t>
       </w:r>
       <w:hyperlink r:id="rId8" w:history="1">
         <w:r>
@@ -1189,23 +1165,7 @@
         <w:ind w:left="283"/>
       </w:pPr>
       <w:r>
-        <w:t xml:space="preserve">+ Xác nhận không có route/interface chồng lấn </w:t>
-      </w:r>
-      <w:proofErr w:type="spellStart"/>
-      <w:r>
-        <w:t>với</w:t>
-      </w:r>
-      <w:proofErr w:type="spellEnd"/>
-      <w:r>
-        <w:t xml:space="preserve"> 10.0.0.0/8 </w:t>
-      </w:r>
-      <w:proofErr w:type="spellStart"/>
-      <w:r>
-        <w:t>và</w:t>
-      </w:r>
-      <w:proofErr w:type="spellEnd"/>
-      <w:r>
-        <w:t xml:space="preserve"> 172.16.0.0/16.</w:t>
+        <w:t>+ Xác nhận không có route/interface chồng lấn với 10.0.0.0/8 và 172.16.0.0/16.</w:t>
       </w:r>
     </w:p>
     <w:p>
@@ -1214,6 +1174,9 @@
         <w:ind w:left="283"/>
       </w:pPr>
       <w:r>
+        <w:rPr>
+          <w:noProof/>
+        </w:rPr>
         <w:lastRenderedPageBreak/>
         <w:drawing>
           <wp:inline distT="0" distB="0" distL="0" distR="0" wp14:anchorId="259BF305" wp14:editId="4A1F42DD">
@@ -1329,15 +1292,7 @@
         <w:ind w:left="283"/>
       </w:pPr>
       <w:r>
-        <w:t xml:space="preserve">+ Adapter 3: Internal Network, Name = </w:t>
-      </w:r>
-      <w:proofErr w:type="spellStart"/>
-      <w:r>
-        <w:t>dmz</w:t>
-      </w:r>
-      <w:proofErr w:type="spellEnd"/>
-      <w:r>
-        <w:t>-net → DMZ.</w:t>
+        <w:t>+ Adapter 3: Internal Network, Name = dmz-net → DMZ.</w:t>
       </w:r>
     </w:p>
     <w:p>
@@ -1346,6 +1301,9 @@
         <w:ind w:left="283"/>
       </w:pPr>
       <w:r>
+        <w:rPr>
+          <w:noProof/>
+        </w:rPr>
         <w:lastRenderedPageBreak/>
         <w:drawing>
           <wp:inline distT="0" distB="0" distL="0" distR="0" wp14:anchorId="53F50001" wp14:editId="28958110">
@@ -1440,23 +1398,7 @@
         <w:ind w:left="283"/>
       </w:pPr>
       <w:r>
-        <w:t xml:space="preserve">+ Khởi động VM, chọn Install, hoàn tất cài đặt, reboot </w:t>
-      </w:r>
-      <w:proofErr w:type="spellStart"/>
-      <w:r>
-        <w:t>và</w:t>
-      </w:r>
-      <w:proofErr w:type="spellEnd"/>
-      <w:r>
-        <w:t xml:space="preserve"> </w:t>
-      </w:r>
-      <w:proofErr w:type="spellStart"/>
-      <w:r>
-        <w:t>tháo</w:t>
-      </w:r>
-      <w:proofErr w:type="spellEnd"/>
-      <w:r>
-        <w:t xml:space="preserve"> ISO.</w:t>
+        <w:t>+ Khởi động VM, chọn Install, hoàn tất cài đặt, reboot và tháo ISO.</w:t>
       </w:r>
     </w:p>
     <w:p>
@@ -1524,21 +1466,8 @@
         <w:pStyle w:val="LabH2"/>
       </w:pPr>
       <w:r>
-        <w:t xml:space="preserve">4. Cấu hình LAN </w:t>
-      </w:r>
-      <w:proofErr w:type="spellStart"/>
-      <w:r>
-        <w:t>trên</w:t>
-      </w:r>
-      <w:proofErr w:type="spellEnd"/>
-      <w:r>
-        <w:t xml:space="preserve"> console </w:t>
-      </w:r>
-      <w:proofErr w:type="spellStart"/>
-      <w:r>
-        <w:t>pfSense</w:t>
-      </w:r>
-      <w:proofErr w:type="spellEnd"/>
+        <w:t>4. Cấu hình LAN trên console pfSense</w:t>
+      </w:r>
     </w:p>
     <w:p>
       <w:pPr>
@@ -1573,31 +1502,7 @@
         <w:ind w:left="283"/>
       </w:pPr>
       <w:r>
-        <w:t xml:space="preserve">+ Không bật DHCP </w:t>
-      </w:r>
-      <w:proofErr w:type="spellStart"/>
-      <w:r>
-        <w:t>trong</w:t>
-      </w:r>
-      <w:proofErr w:type="spellEnd"/>
-      <w:r>
-        <w:t xml:space="preserve"> </w:t>
-      </w:r>
-      <w:proofErr w:type="spellStart"/>
-      <w:r>
-        <w:t>bài</w:t>
-      </w:r>
-      <w:proofErr w:type="spellEnd"/>
-      <w:r>
-        <w:t xml:space="preserve"> lab </w:t>
-      </w:r>
-      <w:proofErr w:type="spellStart"/>
-      <w:r>
-        <w:t>này</w:t>
-      </w:r>
-      <w:proofErr w:type="spellEnd"/>
-      <w:r>
-        <w:t>.</w:t>
+        <w:t>+ Không bật DHCP trong bài lab này.</w:t>
       </w:r>
     </w:p>
     <w:p>
@@ -1606,6 +1511,9 @@
         <w:ind w:left="283"/>
       </w:pPr>
       <w:r>
+        <w:rPr>
+          <w:noProof/>
+        </w:rPr>
         <w:lastRenderedPageBreak/>
         <w:drawing>
           <wp:inline distT="0" distB="0" distL="0" distR="0" wp14:anchorId="69C2DEBC" wp14:editId="521B3B47">
@@ -1650,6 +1558,9 @@
         <w:ind w:left="283"/>
       </w:pPr>
       <w:r>
+        <w:rPr>
+          <w:noProof/>
+        </w:rPr>
         <w:drawing>
           <wp:inline distT="0" distB="0" distL="0" distR="0" wp14:anchorId="34B0EC70" wp14:editId="50942C9B">
             <wp:extent cx="6152515" cy="4229100"/>
@@ -1692,23 +1603,7 @@
         <w:pStyle w:val="LabH2"/>
       </w:pPr>
       <w:r>
-        <w:t xml:space="preserve">5. </w:t>
-      </w:r>
-      <w:proofErr w:type="spellStart"/>
-      <w:r>
-        <w:t>Cấu</w:t>
-      </w:r>
-      <w:proofErr w:type="spellEnd"/>
-      <w:r>
-        <w:t xml:space="preserve"> </w:t>
-      </w:r>
-      <w:proofErr w:type="spellStart"/>
-      <w:r>
-        <w:t>hình</w:t>
-      </w:r>
-      <w:proofErr w:type="spellEnd"/>
-      <w:r>
-        <w:t xml:space="preserve"> Domain Controller</w:t>
+        <w:t>5. Cấu hình Domain Controller</w:t>
       </w:r>
     </w:p>
     <w:p>
@@ -1790,31 +1685,7 @@
         <w:ind w:left="283"/>
       </w:pPr>
       <w:r>
-        <w:t xml:space="preserve">+ Kiểm thử tách biệt: ping 8.8.8.8 để kiểm tra IP; Resolve-DnsName example.com hoặc nslookup example.com </w:t>
-      </w:r>
-      <w:proofErr w:type="spellStart"/>
-      <w:r>
-        <w:t>để</w:t>
-      </w:r>
-      <w:proofErr w:type="spellEnd"/>
-      <w:r>
-        <w:t xml:space="preserve"> </w:t>
-      </w:r>
-      <w:proofErr w:type="spellStart"/>
-      <w:r>
-        <w:t>kiểm</w:t>
-      </w:r>
-      <w:proofErr w:type="spellEnd"/>
-      <w:r>
-        <w:t xml:space="preserve"> </w:t>
-      </w:r>
-      <w:proofErr w:type="spellStart"/>
-      <w:r>
-        <w:t>tra</w:t>
-      </w:r>
-      <w:proofErr w:type="spellEnd"/>
-      <w:r>
-        <w:t xml:space="preserve"> DNS.</w:t>
+        <w:t>+ Kiểm thử tách biệt: ping 8.8.8.8 để kiểm tra IP; Resolve-DnsName example.com hoặc nslookup example.com để kiểm tra DNS.</w:t>
       </w:r>
     </w:p>
     <w:p>
@@ -1823,6 +1694,9 @@
         <w:ind w:left="283"/>
       </w:pPr>
       <w:r>
+        <w:rPr>
+          <w:noProof/>
+        </w:rPr>
         <w:drawing>
           <wp:inline distT="0" distB="0" distL="0" distR="0" wp14:anchorId="27982A7D" wp14:editId="691E1E4E">
             <wp:extent cx="6152515" cy="3180715"/>
@@ -1866,6 +1740,9 @@
         <w:ind w:left="283"/>
       </w:pPr>
       <w:r>
+        <w:rPr>
+          <w:noProof/>
+        </w:rPr>
         <w:lastRenderedPageBreak/>
         <w:drawing>
           <wp:inline distT="0" distB="0" distL="0" distR="0" wp14:anchorId="26D3EB95" wp14:editId="288C39A6">
@@ -1963,39 +1840,7 @@
         <w:ind w:left="283"/>
       </w:pPr>
       <w:r>
-        <w:t xml:space="preserve">+ Chạy Setup Wizard, giữ LAN = 10.0.0.1/8 và đổi </w:t>
-      </w:r>
-      <w:proofErr w:type="spellStart"/>
-      <w:r>
-        <w:t>mật</w:t>
-      </w:r>
-      <w:proofErr w:type="spellEnd"/>
-      <w:r>
-        <w:t xml:space="preserve"> </w:t>
-      </w:r>
-      <w:proofErr w:type="spellStart"/>
-      <w:r>
-        <w:t>khẩu</w:t>
-      </w:r>
-      <w:proofErr w:type="spellEnd"/>
-      <w:r>
-        <w:t xml:space="preserve"> </w:t>
-      </w:r>
-      <w:proofErr w:type="spellStart"/>
-      <w:r>
-        <w:t>quản</w:t>
-      </w:r>
-      <w:proofErr w:type="spellEnd"/>
-      <w:r>
-        <w:t xml:space="preserve"> </w:t>
-      </w:r>
-      <w:proofErr w:type="spellStart"/>
-      <w:r>
-        <w:t>trị</w:t>
-      </w:r>
-      <w:proofErr w:type="spellEnd"/>
-      <w:r>
-        <w:t>.</w:t>
+        <w:t>+ Chạy Setup Wizard, giữ LAN = 10.0.0.1/8 và đổi mật khẩu quản trị.</w:t>
       </w:r>
     </w:p>
     <w:p>
@@ -2004,6 +1849,9 @@
         <w:ind w:left="283"/>
       </w:pPr>
       <w:r>
+        <w:rPr>
+          <w:noProof/>
+        </w:rPr>
         <w:lastRenderedPageBreak/>
         <w:drawing>
           <wp:inline distT="0" distB="0" distL="0" distR="0" wp14:anchorId="7B2C448D" wp14:editId="5656877F">
@@ -2163,6 +2011,9 @@
         <w:ind w:left="283"/>
       </w:pPr>
       <w:r>
+        <w:rPr>
+          <w:noProof/>
+        </w:rPr>
         <w:lastRenderedPageBreak/>
         <w:drawing>
           <wp:inline distT="0" distB="0" distL="0" distR="0" wp14:anchorId="668B551E" wp14:editId="13EB0C3C">
@@ -2207,6 +2058,9 @@
         <w:ind w:left="283"/>
       </w:pPr>
       <w:r>
+        <w:rPr>
+          <w:noProof/>
+        </w:rPr>
         <w:drawing>
           <wp:inline distT="0" distB="0" distL="0" distR="0" wp14:anchorId="744F06C2" wp14:editId="41AA7341">
             <wp:extent cx="6152515" cy="3352800"/>
@@ -2246,19 +2100,54 @@
     </w:p>
     <w:p>
       <w:pPr>
-        <w:pStyle w:val="LabH2"/>
-      </w:pPr>
-      <w:r>
-        <w:t>8. Kiểm tra Outbound NAT</w:t>
-      </w:r>
-    </w:p>
-    <w:p>
-      <w:pPr>
         <w:spacing w:after="40"/>
         <w:ind w:left="283"/>
       </w:pPr>
       <w:r>
-        <w:t>+ Vào Firewall → NAT → Outbound.</w:t>
+        <w:lastRenderedPageBreak/>
+        <w:drawing>
+          <wp:inline distT="0" distB="0" distL="0" distR="0" wp14:anchorId="52ED54F9" wp14:editId="2BB2AB15">
+            <wp:extent cx="6152515" cy="3480435"/>
+            <wp:effectExtent l="0" t="0" r="635" b="5715"/>
+            <wp:docPr id="1981827798" name="Picture 1" descr="A computer screen shot of a black screen&#10;&#10;Description automatically generated"/>
+            <wp:cNvGraphicFramePr>
+              <a:graphicFrameLocks xmlns:a="http://schemas.openxmlformats.org/drawingml/2006/main" noChangeAspect="1"/>
+            </wp:cNvGraphicFramePr>
+            <a:graphic xmlns:a="http://schemas.openxmlformats.org/drawingml/2006/main">
+              <a:graphicData uri="http://schemas.openxmlformats.org/drawingml/2006/picture">
+                <pic:pic xmlns:pic="http://schemas.openxmlformats.org/drawingml/2006/picture">
+                  <pic:nvPicPr>
+                    <pic:cNvPr id="1981827798" name="Picture 1" descr="A computer screen shot of a black screen&#10;&#10;Description automatically generated"/>
+                    <pic:cNvPicPr/>
+                  </pic:nvPicPr>
+                  <pic:blipFill>
+                    <a:blip r:embed="rId20"/>
+                    <a:stretch>
+                      <a:fillRect/>
+                    </a:stretch>
+                  </pic:blipFill>
+                  <pic:spPr>
+                    <a:xfrm>
+                      <a:off x="0" y="0"/>
+                      <a:ext cx="6152515" cy="3480435"/>
+                    </a:xfrm>
+                    <a:prstGeom prst="rect">
+                      <a:avLst/>
+                    </a:prstGeom>
+                  </pic:spPr>
+                </pic:pic>
+              </a:graphicData>
+            </a:graphic>
+          </wp:inline>
+        </w:drawing>
+      </w:r>
+    </w:p>
+    <w:p>
+      <w:pPr>
+        <w:pStyle w:val="LabH2"/>
+      </w:pPr>
+      <w:r>
+        <w:t>8. Kiểm tra Outbound NAT</w:t>
       </w:r>
     </w:p>
     <w:p>
@@ -2267,7 +2156,7 @@
         <w:ind w:left="283"/>
       </w:pPr>
       <w:r>
-        <w:t>+ Giữ Automatic Outbound NAT hoặc chọn Hybrid Outbound NAT.</w:t>
+        <w:t>+ Vào Firewall → NAT → Outbound.</w:t>
       </w:r>
     </w:p>
     <w:p>
@@ -2276,7 +2165,7 @@
         <w:ind w:left="283"/>
       </w:pPr>
       <w:r>
-        <w:t>+ Xác nhận Automatic Rules có LAN 10.0.0.0/8 và sau khi DMZ được Apply Changes thì có thêm DMZ/OPT1.</w:t>
+        <w:t>+ Giữ Automatic Outbound NAT hoặc chọn Hybrid Outbound NAT.</w:t>
       </w:r>
     </w:p>
     <w:p>
@@ -2285,25 +2174,7 @@
         <w:ind w:left="283"/>
       </w:pPr>
       <w:r>
-        <w:t>+ Không cần tạo manual Outbound NAT chỉ để LAN/DMZ ra Internet.</w:t>
-      </w:r>
-    </w:p>
-    <w:p>
-      <w:pPr>
-        <w:shd w:val="clear" w:color="auto" w:fill="FFF2CC"/>
-        <w:spacing w:before="80" w:after="80"/>
-      </w:pPr>
-      <w:r>
-        <w:lastRenderedPageBreak/>
-        <w:t>📸 [CHỤP ẢNH MINH CHỨNG SỐ 8] Ảnh Firewall → NAT → Outbound thể hiện Automatic/Hybrid và automatic rules.</w:t>
-      </w:r>
-    </w:p>
-    <w:p>
-      <w:pPr>
-        <w:pStyle w:val="LabH2"/>
-      </w:pPr>
-      <w:r>
-        <w:t>9. Chuẩn hóa LAN ruleset và tạo rule nền tảng</w:t>
+        <w:t>+ Xác nhận Automatic Rules có LAN 10.0.0.0/8 và sau khi DMZ được Apply Changes thì có thêm DMZ/OPT1.</w:t>
       </w:r>
     </w:p>
     <w:p>
@@ -2312,7 +2183,7 @@
         <w:ind w:left="283"/>
       </w:pPr>
       <w:r>
-        <w:t>+ Vào Firewall → Rules → LAN.</w:t>
+        <w:t>+ Không cần tạo manual Outbound NAT chỉ để LAN/DMZ ra Internet.</w:t>
       </w:r>
     </w:p>
     <w:p>
@@ -2321,7 +2192,50 @@
         <w:ind w:left="283"/>
       </w:pPr>
       <w:r>
-        <w:t>+ Disable cả hai Default allow LAN to any (IPv4 và IPv6).</w:t>
+        <w:drawing>
+          <wp:inline distT="0" distB="0" distL="0" distR="0" wp14:anchorId="65CB1785" wp14:editId="227B77C8">
+            <wp:extent cx="6152515" cy="3350260"/>
+            <wp:effectExtent l="0" t="0" r="635" b="2540"/>
+            <wp:docPr id="1772029347" name="Picture 1" descr="A screenshot of a computer&#10;&#10;Description automatically generated"/>
+            <wp:cNvGraphicFramePr>
+              <a:graphicFrameLocks xmlns:a="http://schemas.openxmlformats.org/drawingml/2006/main" noChangeAspect="1"/>
+            </wp:cNvGraphicFramePr>
+            <a:graphic xmlns:a="http://schemas.openxmlformats.org/drawingml/2006/main">
+              <a:graphicData uri="http://schemas.openxmlformats.org/drawingml/2006/picture">
+                <pic:pic xmlns:pic="http://schemas.openxmlformats.org/drawingml/2006/picture">
+                  <pic:nvPicPr>
+                    <pic:cNvPr id="1772029347" name="Picture 1" descr="A screenshot of a computer&#10;&#10;Description automatically generated"/>
+                    <pic:cNvPicPr/>
+                  </pic:nvPicPr>
+                  <pic:blipFill>
+                    <a:blip r:embed="rId21"/>
+                    <a:stretch>
+                      <a:fillRect/>
+                    </a:stretch>
+                  </pic:blipFill>
+                  <pic:spPr>
+                    <a:xfrm>
+                      <a:off x="0" y="0"/>
+                      <a:ext cx="6152515" cy="3350260"/>
+                    </a:xfrm>
+                    <a:prstGeom prst="rect">
+                      <a:avLst/>
+                    </a:prstGeom>
+                  </pic:spPr>
+                </pic:pic>
+              </a:graphicData>
+            </a:graphic>
+          </wp:inline>
+        </w:drawing>
+      </w:r>
+    </w:p>
+    <w:p>
+      <w:pPr>
+        <w:pStyle w:val="LabH2"/>
+      </w:pPr>
+      <w:r>
+        <w:lastRenderedPageBreak/>
+        <w:t>9. Chuẩn hóa LAN ruleset và tạo rule nền tảng</w:t>
       </w:r>
     </w:p>
     <w:p>
@@ -2330,7 +2244,7 @@
         <w:ind w:left="283"/>
       </w:pPr>
       <w:r>
-        <w:t>+ Giữ Anti-Lockout Rule để không mất WebGUI.</w:t>
+        <w:t>+ Vào Firewall → Rules → LAN.</w:t>
       </w:r>
     </w:p>
     <w:p>
@@ -2339,7 +2253,7 @@
         <w:ind w:left="283"/>
       </w:pPr>
       <w:r>
-        <w:t>+ Apply Changes.</w:t>
+        <w:t>+ Disable cả hai Default allow LAN to any (IPv4 và IPv6).</w:t>
       </w:r>
     </w:p>
     <w:p>
@@ -2348,7 +2262,7 @@
         <w:ind w:left="283"/>
       </w:pPr>
       <w:r>
-        <w:t>+ Vào Diagnostics → States → Reset States → State Table → Reset.</w:t>
+        <w:t>+ Giữ Anti-Lockout Rule để không mất WebGUI.</w:t>
       </w:r>
     </w:p>
     <w:p>
@@ -2357,24 +2271,7 @@
         <w:ind w:left="283"/>
       </w:pPr>
       <w:r>
-        <w:t>+ Tạo rule mới do sinh viên quản lý: Action = Pass, Protocol = Any, Source = LAN net, Destination = Any.</w:t>
-      </w:r>
-    </w:p>
-    <w:p>
-      <w:pPr>
-        <w:shd w:val="clear" w:color="auto" w:fill="FFF2CC"/>
-        <w:spacing w:before="80" w:after="80"/>
-      </w:pPr>
-      <w:r>
-        <w:t>📸 [CHỤP ẢNH MINH CHỨNG SỐ 9] Ảnh LAN ruleset: Default allow đã Disabled và rule Pass LAN net → Any do sinh viên tạo.</w:t>
-      </w:r>
-    </w:p>
-    <w:p>
-      <w:pPr>
-        <w:pStyle w:val="LabH2"/>
-      </w:pPr>
-      <w:r>
-        <w:t>10. Kiểm thử rule nền tảng từ Domain Controller</w:t>
+        <w:t>+ Apply Changes.</w:t>
       </w:r>
     </w:p>
     <w:p>
@@ -2383,7 +2280,7 @@
         <w:ind w:left="283"/>
       </w:pPr>
       <w:r>
-        <w:t>+ Khi rule LAN net → Any đang Enabled, chạy trên DC:</w:t>
+        <w:t>+ Vào Diagnostics → States → Reset States → State Table → Reset.</w:t>
       </w:r>
     </w:p>
     <w:p>
@@ -2392,7 +2289,7 @@
         <w:ind w:left="283"/>
       </w:pPr>
       <w:r>
-        <w:t xml:space="preserve">  ping 8.8.8.8</w:t>
+        <w:t>+ Tạo rule mới do sinh viên quản lý: Action = Pass, Protocol = Any, Source = LAN net, Destination = Any.</w:t>
       </w:r>
     </w:p>
     <w:p>
@@ -2401,7 +2298,49 @@
         <w:ind w:left="283"/>
       </w:pPr>
       <w:r>
-        <w:t xml:space="preserve">  Resolve-DnsName example.com</w:t>
+        <w:drawing>
+          <wp:inline distT="0" distB="0" distL="0" distR="0" wp14:anchorId="08B73CAC" wp14:editId="154D99FD">
+            <wp:extent cx="6152515" cy="3138170"/>
+            <wp:effectExtent l="0" t="0" r="635" b="5080"/>
+            <wp:docPr id="1094344036" name="Picture 1" descr="A screenshot of a computer&#10;&#10;Description automatically generated"/>
+            <wp:cNvGraphicFramePr>
+              <a:graphicFrameLocks xmlns:a="http://schemas.openxmlformats.org/drawingml/2006/main" noChangeAspect="1"/>
+            </wp:cNvGraphicFramePr>
+            <a:graphic xmlns:a="http://schemas.openxmlformats.org/drawingml/2006/main">
+              <a:graphicData uri="http://schemas.openxmlformats.org/drawingml/2006/picture">
+                <pic:pic xmlns:pic="http://schemas.openxmlformats.org/drawingml/2006/picture">
+                  <pic:nvPicPr>
+                    <pic:cNvPr id="1094344036" name="Picture 1" descr="A screenshot of a computer&#10;&#10;Description automatically generated"/>
+                    <pic:cNvPicPr/>
+                  </pic:nvPicPr>
+                  <pic:blipFill>
+                    <a:blip r:embed="rId22"/>
+                    <a:stretch>
+                      <a:fillRect/>
+                    </a:stretch>
+                  </pic:blipFill>
+                  <pic:spPr>
+                    <a:xfrm>
+                      <a:off x="0" y="0"/>
+                      <a:ext cx="6152515" cy="3138170"/>
+                    </a:xfrm>
+                    <a:prstGeom prst="rect">
+                      <a:avLst/>
+                    </a:prstGeom>
+                  </pic:spPr>
+                </pic:pic>
+              </a:graphicData>
+            </a:graphic>
+          </wp:inline>
+        </w:drawing>
+      </w:r>
+    </w:p>
+    <w:p>
+      <w:pPr>
+        <w:pStyle w:val="LabH2"/>
+      </w:pPr>
+      <w:r>
+        <w:t>10. Kiểm thử rule nền tảng từ Domain Controller</w:t>
       </w:r>
     </w:p>
     <w:p>
@@ -2410,7 +2349,7 @@
         <w:ind w:left="283"/>
       </w:pPr>
       <w:r>
-        <w:t xml:space="preserve">  curl.exe -4 https://example.com</w:t>
+        <w:t>+ Khi rule LAN net → Any đang Enabled, chạy trên DC:</w:t>
       </w:r>
     </w:p>
     <w:p>
@@ -2419,7 +2358,7 @@
         <w:ind w:left="283"/>
       </w:pPr>
       <w:r>
-        <w:t>+ Kỳ vọng theo tài liệu: IP, DNS và HTTPS hoạt động.</w:t>
+        <w:t xml:space="preserve">  ping 8.8.8.8</w:t>
       </w:r>
     </w:p>
     <w:p>
@@ -2428,7 +2367,7 @@
         <w:ind w:left="283"/>
       </w:pPr>
       <w:r>
-        <w:t>+ Sau đó Disable rule LAN net → Any, Apply Changes, Reset States và mở phép thử mới.</w:t>
+        <w:t xml:space="preserve">  Resolve-DnsName example.com</w:t>
       </w:r>
     </w:p>
     <w:p>
@@ -2437,16 +2376,78 @@
         <w:ind w:left="283"/>
       </w:pPr>
       <w:r>
+        <w:t xml:space="preserve">  curl.exe -4 https://example.com</w:t>
+      </w:r>
+    </w:p>
+    <w:p>
+      <w:pPr>
+        <w:spacing w:after="40"/>
+        <w:ind w:left="283"/>
+      </w:pPr>
+      <w:r>
+        <w:t>+ Kỳ vọng theo tài liệu: IP, DNS và HTTPS hoạt động.</w:t>
+      </w:r>
+    </w:p>
+    <w:p>
+      <w:pPr>
+        <w:spacing w:after="40"/>
+        <w:ind w:left="283"/>
+      </w:pPr>
+      <w:r>
+        <w:t>+ Sau đó Disable rule LAN net → Any, Apply Changes, Reset States và mở phép thử mới.</w:t>
+      </w:r>
+    </w:p>
+    <w:p>
+      <w:pPr>
+        <w:spacing w:after="40"/>
+        <w:ind w:left="283"/>
+      </w:pPr>
+      <w:r>
         <w:t>+ Kỳ vọng theo tài liệu: lưu lượng IPv4 mới từ DC ra Internet bị chặn khi hai Default allow cũng đang Disabled.</w:t>
       </w:r>
     </w:p>
     <w:p>
       <w:pPr>
-        <w:shd w:val="clear" w:color="auto" w:fill="FFF2CC"/>
-        <w:spacing w:before="80" w:after="80"/>
-      </w:pPr>
-      <w:r>
-        <w:t>📸 [CHỤP ẢNH MINH CHỨNG SỐ 10] Ảnh PASS khi rule nền tảng bật và FAIL sau khi disable rule + Reset States.</w:t>
+        <w:spacing w:after="40"/>
+        <w:ind w:left="283"/>
+      </w:pPr>
+      <w:r>
+        <w:lastRenderedPageBreak/>
+        <w:drawing>
+          <wp:inline distT="0" distB="0" distL="0" distR="0" wp14:anchorId="222ADE66" wp14:editId="1CEB435A">
+            <wp:extent cx="6152515" cy="3509010"/>
+            <wp:effectExtent l="0" t="0" r="635" b="0"/>
+            <wp:docPr id="209192723" name="Picture 1" descr="A screenshot of a computer&#10;&#10;Description automatically generated"/>
+            <wp:cNvGraphicFramePr>
+              <a:graphicFrameLocks xmlns:a="http://schemas.openxmlformats.org/drawingml/2006/main" noChangeAspect="1"/>
+            </wp:cNvGraphicFramePr>
+            <a:graphic xmlns:a="http://schemas.openxmlformats.org/drawingml/2006/main">
+              <a:graphicData uri="http://schemas.openxmlformats.org/drawingml/2006/picture">
+                <pic:pic xmlns:pic="http://schemas.openxmlformats.org/drawingml/2006/picture">
+                  <pic:nvPicPr>
+                    <pic:cNvPr id="209192723" name="Picture 1" descr="A screenshot of a computer&#10;&#10;Description automatically generated"/>
+                    <pic:cNvPicPr/>
+                  </pic:nvPicPr>
+                  <pic:blipFill>
+                    <a:blip r:embed="rId23"/>
+                    <a:stretch>
+                      <a:fillRect/>
+                    </a:stretch>
+                  </pic:blipFill>
+                  <pic:spPr>
+                    <a:xfrm>
+                      <a:off x="0" y="0"/>
+                      <a:ext cx="6152515" cy="3509010"/>
+                    </a:xfrm>
+                    <a:prstGeom prst="rect">
+                      <a:avLst/>
+                    </a:prstGeom>
+                  </pic:spPr>
+                </pic:pic>
+              </a:graphicData>
+            </a:graphic>
+          </wp:inline>
+        </w:drawing>
       </w:r>
     </w:p>
     <w:p>
@@ -2518,7 +2519,6 @@
         <w:ind w:left="283"/>
       </w:pPr>
       <w:r>
-        <w:lastRenderedPageBreak/>
         <w:t xml:space="preserve">  - Pass TCP 80/443 | Source: LAN net | Destination: Any</w:t>
       </w:r>
     </w:p>
@@ -2564,31 +2564,7 @@
         <w:ind w:left="283"/>
       </w:pPr>
       <w:r>
-        <w:t xml:space="preserve">+ </w:t>
-      </w:r>
-      <w:proofErr w:type="spellStart"/>
-      <w:r>
-        <w:t>Kết</w:t>
-      </w:r>
-      <w:proofErr w:type="spellEnd"/>
-      <w:r>
-        <w:t xml:space="preserve"> </w:t>
-      </w:r>
-      <w:proofErr w:type="spellStart"/>
-      <w:r>
-        <w:t>quả</w:t>
-      </w:r>
-      <w:proofErr w:type="spellEnd"/>
-      <w:r>
-        <w:t xml:space="preserve"> </w:t>
-      </w:r>
-      <w:proofErr w:type="spellStart"/>
-      <w:r>
-        <w:t>thực</w:t>
-      </w:r>
-      <w:proofErr w:type="spellEnd"/>
-      <w:r>
-        <w:t xml:space="preserve"> tế: ..............................................................</w:t>
+        <w:t>+ Kết quả thực tế: ..............................................................</w:t>
       </w:r>
     </w:p>
     <w:p>
@@ -2623,6 +2599,7 @@
         <w:ind w:left="283"/>
       </w:pPr>
       <w:r>
+        <w:lastRenderedPageBreak/>
         <w:t>+ LAN-Test: Ubuntu Server 22.04/24.04 LTS minimal, IP 10.0.0.3/8, Gateway 10.0.0.1, card Host-only cùng LAN.</w:t>
       </w:r>
     </w:p>
@@ -2704,31 +2681,7 @@
         <w:ind w:left="283"/>
       </w:pPr>
       <w:r>
-        <w:t xml:space="preserve">+ </w:t>
-      </w:r>
-      <w:proofErr w:type="spellStart"/>
-      <w:r>
-        <w:t>Kết</w:t>
-      </w:r>
-      <w:proofErr w:type="spellEnd"/>
-      <w:r>
-        <w:t xml:space="preserve"> </w:t>
-      </w:r>
-      <w:proofErr w:type="spellStart"/>
-      <w:r>
-        <w:t>quả</w:t>
-      </w:r>
-      <w:proofErr w:type="spellEnd"/>
-      <w:r>
-        <w:t xml:space="preserve"> </w:t>
-      </w:r>
-      <w:proofErr w:type="spellStart"/>
-      <w:r>
-        <w:t>thực</w:t>
-      </w:r>
-      <w:proofErr w:type="spellEnd"/>
-      <w:r>
-        <w:t xml:space="preserve"> tế: ..............................................................</w:t>
+        <w:t>+ Kết quả thực tế: ..............................................................</w:t>
       </w:r>
     </w:p>
     <w:p>
@@ -2826,15 +2779,7 @@
         <w:ind w:left="283"/>
       </w:pPr>
       <w:r>
-        <w:t xml:space="preserve">+ </w:t>
-      </w:r>
-      <w:proofErr w:type="spellStart"/>
-      <w:r>
-        <w:t>Xóa</w:t>
-      </w:r>
-      <w:proofErr w:type="spellEnd"/>
-      <w:r>
-        <w:t xml:space="preserve"> rule Windows Firewall tạm sau khi chụp ảnh:</w:t>
+        <w:t>+ Xóa rule Windows Firewall tạm sau khi chụp ảnh:</w:t>
       </w:r>
     </w:p>
     <w:p>
@@ -2852,7 +2797,6 @@
         <w:ind w:left="283"/>
       </w:pPr>
       <w:r>
-        <w:lastRenderedPageBreak/>
         <w:t>+ Kết quả thực tế: ..............................................................</w:t>
       </w:r>
     </w:p>
@@ -2924,6 +2868,7 @@
         <w:ind w:left="283"/>
       </w:pPr>
       <w:r>
+        <w:lastRenderedPageBreak/>
         <w:t xml:space="preserve">  - Protocol = TCP</w:t>
       </w:r>
     </w:p>
@@ -3005,31 +2950,7 @@
         <w:ind w:left="283"/>
       </w:pPr>
       <w:r>
-        <w:t xml:space="preserve">+ </w:t>
-      </w:r>
-      <w:proofErr w:type="spellStart"/>
-      <w:r>
-        <w:t>Kết</w:t>
-      </w:r>
-      <w:proofErr w:type="spellEnd"/>
-      <w:r>
-        <w:t xml:space="preserve"> </w:t>
-      </w:r>
-      <w:proofErr w:type="spellStart"/>
-      <w:r>
-        <w:t>quả</w:t>
-      </w:r>
-      <w:proofErr w:type="spellEnd"/>
-      <w:r>
-        <w:t xml:space="preserve"> </w:t>
-      </w:r>
-      <w:proofErr w:type="spellStart"/>
-      <w:r>
-        <w:t>thực</w:t>
-      </w:r>
-      <w:proofErr w:type="spellEnd"/>
-      <w:r>
-        <w:t xml:space="preserve"> tế: ..............................................................</w:t>
+        <w:t>+ Kết quả thực tế: ..............................................................</w:t>
       </w:r>
     </w:p>
     <w:p>
@@ -3091,31 +3012,7 @@
         <w:ind w:left="283"/>
       </w:pPr>
       <w:r>
-        <w:t xml:space="preserve">+ </w:t>
-      </w:r>
-      <w:proofErr w:type="spellStart"/>
-      <w:r>
-        <w:t>Kết</w:t>
-      </w:r>
-      <w:proofErr w:type="spellEnd"/>
-      <w:r>
-        <w:t xml:space="preserve"> </w:t>
-      </w:r>
-      <w:proofErr w:type="spellStart"/>
-      <w:r>
-        <w:t>quả</w:t>
-      </w:r>
-      <w:proofErr w:type="spellEnd"/>
-      <w:r>
-        <w:t xml:space="preserve"> </w:t>
-      </w:r>
-      <w:proofErr w:type="spellStart"/>
-      <w:r>
-        <w:t>thực</w:t>
-      </w:r>
-      <w:proofErr w:type="spellEnd"/>
-      <w:r>
-        <w:t xml:space="preserve"> tế: ..............................................................</w:t>
+        <w:t>+ Kết quả thực tế: ..............................................................</w:t>
       </w:r>
     </w:p>
     <w:p>
@@ -3144,6 +3041,50 @@
       </w:pPr>
       <w:r>
         <w:t>Tài liệu gốc đặt ra 6 câu hỏi nhưng không cung cấp đáp án. Phần dưới đây được để trống để hoàn thiện sau khi thực hành hoặc theo yêu cầu giảng viên.</w:t>
+      </w:r>
+    </w:p>
+    <w:p>
+      <w:r>
+        <w:rPr>
+          <w:b/>
+          <w:bCs/>
+        </w:rPr>
+        <w:t>1. Phân biệt vai trò của NAT và firewall rule trong mô hình.</w:t>
+      </w:r>
+      <w:r>
+        <w:br/>
+      </w:r>
+      <w:r>
+        <w:rPr>
+          <w:b/>
+          <w:bCs/>
+        </w:rPr>
+        <w:t>Trả lời:</w:t>
+      </w:r>
+      <w:r>
+        <w:t xml:space="preserve"> NAT có nhiệm vụ chuyển đổi địa chỉ IP giữa các mạng, giúp các máy trong LAN/DMZ truy cập Internet hoặc chuyển tiếp kết nối từ bên ngoài vào máy chủ nội bộ. Firewall rule có nhiệm vụ cho phép hoặc chặn lưu lượng mạng dựa trên các điều kiện như địa chỉ IP, giao thức và cổng dịch vụ.</w:t>
+      </w:r>
+    </w:p>
+    <w:p>
+      <w:r>
+        <w:rPr>
+          <w:b/>
+          <w:bCs/>
+        </w:rPr>
+        <w:t>2. Vì sao nên tách máy chủ Web/Mail/FTP vào DMZ thay vì đặt trong LAN?</w:t>
+      </w:r>
+      <w:r>
+        <w:br/>
+      </w:r>
+      <w:r>
+        <w:rPr>
+          <w:b/>
+          <w:bCs/>
+        </w:rPr>
+        <w:t>Trả lời:</w:t>
+      </w:r>
+      <w:r>
+        <w:t xml:space="preserve"> Vì các máy chủ Web/Mail/FTP thường cung cấp dịch vụ ra bên ngoài nên có nguy cơ bị tấn công cao. Đặt chúng trong DMZ giúp cách ly với mạng LAN, hạn chế kẻ tấn công truy cập vào mạng nội bộ nếu máy chủ bị xâm nhập.</w:t>
       </w:r>
     </w:p>
     <w:p>
@@ -3153,2002 +3094,42 @@
           <w:bCs/>
         </w:rPr>
         <w:lastRenderedPageBreak/>
-        <w:t xml:space="preserve">1. </w:t>
-      </w:r>
-      <w:proofErr w:type="spellStart"/>
+        <w:t>3. Nếu rule Block nằm dưới một rule Pass tổng quát thì kết quả có thể như thế nào?</w:t>
+      </w:r>
+      <w:r>
+        <w:br/>
+      </w:r>
       <w:r>
         <w:rPr>
           <w:b/>
           <w:bCs/>
         </w:rPr>
-        <w:t>Phân</w:t>
-      </w:r>
-      <w:proofErr w:type="spellEnd"/>
+        <w:t>Trả lời:</w:t>
+      </w:r>
+      <w:r>
+        <w:t xml:space="preserve"> Firewall xử lý các rule theo thứ tự từ trên xuống. Nếu lưu lượng đã khớp với rule Pass tổng quát ở phía trên thì sẽ được cho phép và rule Block phía dưới không còn tác dụng đối với lưu lượng đó.</w:t>
+      </w:r>
+    </w:p>
+    <w:p>
       <w:r>
         <w:rPr>
           <w:b/>
           <w:bCs/>
         </w:rPr>
-        <w:t xml:space="preserve"> </w:t>
-      </w:r>
-      <w:proofErr w:type="spellStart"/>
+        <w:t>4. Muốn chặn ping nhưng vẫn cho truy cập web, cần cấu hình các rule nào?</w:t>
+      </w:r>
+      <w:r>
+        <w:br/>
+      </w:r>
       <w:r>
         <w:rPr>
           <w:b/>
           <w:bCs/>
         </w:rPr>
-        <w:t>biệt</w:t>
-      </w:r>
-      <w:proofErr w:type="spellEnd"/>
-      <w:r>
-        <w:rPr>
-          <w:b/>
-          <w:bCs/>
-        </w:rPr>
-        <w:t xml:space="preserve"> </w:t>
-      </w:r>
-      <w:proofErr w:type="spellStart"/>
-      <w:r>
-        <w:rPr>
-          <w:b/>
-          <w:bCs/>
-        </w:rPr>
-        <w:t>vai</w:t>
-      </w:r>
-      <w:proofErr w:type="spellEnd"/>
-      <w:r>
-        <w:rPr>
-          <w:b/>
-          <w:bCs/>
-        </w:rPr>
-        <w:t xml:space="preserve"> </w:t>
-      </w:r>
-      <w:proofErr w:type="spellStart"/>
-      <w:r>
-        <w:rPr>
-          <w:b/>
-          <w:bCs/>
-        </w:rPr>
-        <w:t>trò</w:t>
-      </w:r>
-      <w:proofErr w:type="spellEnd"/>
-      <w:r>
-        <w:rPr>
-          <w:b/>
-          <w:bCs/>
-        </w:rPr>
-        <w:t xml:space="preserve"> </w:t>
-      </w:r>
-      <w:proofErr w:type="spellStart"/>
-      <w:r>
-        <w:rPr>
-          <w:b/>
-          <w:bCs/>
-        </w:rPr>
-        <w:t>của</w:t>
-      </w:r>
-      <w:proofErr w:type="spellEnd"/>
-      <w:r>
-        <w:rPr>
-          <w:b/>
-          <w:bCs/>
-        </w:rPr>
-        <w:t xml:space="preserve"> NAT </w:t>
-      </w:r>
-      <w:proofErr w:type="spellStart"/>
-      <w:r>
-        <w:rPr>
-          <w:b/>
-          <w:bCs/>
-        </w:rPr>
-        <w:t>và</w:t>
-      </w:r>
-      <w:proofErr w:type="spellEnd"/>
-      <w:r>
-        <w:rPr>
-          <w:b/>
-          <w:bCs/>
-        </w:rPr>
-        <w:t xml:space="preserve"> firewall rule </w:t>
-      </w:r>
-      <w:proofErr w:type="spellStart"/>
-      <w:r>
-        <w:rPr>
-          <w:b/>
-          <w:bCs/>
-        </w:rPr>
-        <w:t>trong</w:t>
-      </w:r>
-      <w:proofErr w:type="spellEnd"/>
-      <w:r>
-        <w:rPr>
-          <w:b/>
-          <w:bCs/>
-        </w:rPr>
-        <w:t xml:space="preserve"> </w:t>
-      </w:r>
-      <w:proofErr w:type="spellStart"/>
-      <w:r>
-        <w:rPr>
-          <w:b/>
-          <w:bCs/>
-        </w:rPr>
-        <w:t>mô</w:t>
-      </w:r>
-      <w:proofErr w:type="spellEnd"/>
-      <w:r>
-        <w:rPr>
-          <w:b/>
-          <w:bCs/>
-        </w:rPr>
-        <w:t xml:space="preserve"> </w:t>
-      </w:r>
-      <w:proofErr w:type="spellStart"/>
-      <w:r>
-        <w:rPr>
-          <w:b/>
-          <w:bCs/>
-        </w:rPr>
-        <w:t>hình</w:t>
-      </w:r>
-      <w:proofErr w:type="spellEnd"/>
-      <w:r>
-        <w:rPr>
-          <w:b/>
-          <w:bCs/>
-        </w:rPr>
-        <w:t>.</w:t>
-      </w:r>
-      <w:r>
-        <w:br/>
-      </w:r>
-      <w:proofErr w:type="spellStart"/>
-      <w:r>
-        <w:rPr>
-          <w:b/>
-          <w:bCs/>
-        </w:rPr>
-        <w:t>Trả</w:t>
-      </w:r>
-      <w:proofErr w:type="spellEnd"/>
-      <w:r>
-        <w:rPr>
-          <w:b/>
-          <w:bCs/>
-        </w:rPr>
-        <w:t xml:space="preserve"> </w:t>
-      </w:r>
-      <w:proofErr w:type="spellStart"/>
-      <w:r>
-        <w:rPr>
-          <w:b/>
-          <w:bCs/>
-        </w:rPr>
-        <w:t>lời</w:t>
-      </w:r>
-      <w:proofErr w:type="spellEnd"/>
-      <w:r>
-        <w:rPr>
-          <w:b/>
-          <w:bCs/>
-        </w:rPr>
-        <w:t>:</w:t>
-      </w:r>
-      <w:r>
-        <w:t xml:space="preserve"> NAT </w:t>
-      </w:r>
-      <w:proofErr w:type="spellStart"/>
-      <w:r>
-        <w:t>có</w:t>
-      </w:r>
-      <w:proofErr w:type="spellEnd"/>
-      <w:r>
-        <w:t xml:space="preserve"> </w:t>
-      </w:r>
-      <w:proofErr w:type="spellStart"/>
-      <w:r>
-        <w:t>nhiệm</w:t>
-      </w:r>
-      <w:proofErr w:type="spellEnd"/>
-      <w:r>
-        <w:t xml:space="preserve"> </w:t>
-      </w:r>
-      <w:proofErr w:type="spellStart"/>
-      <w:r>
-        <w:t>vụ</w:t>
-      </w:r>
-      <w:proofErr w:type="spellEnd"/>
-      <w:r>
-        <w:t xml:space="preserve"> </w:t>
-      </w:r>
-      <w:proofErr w:type="spellStart"/>
-      <w:r>
-        <w:t>chuyển</w:t>
-      </w:r>
-      <w:proofErr w:type="spellEnd"/>
-      <w:r>
-        <w:t xml:space="preserve"> </w:t>
-      </w:r>
-      <w:proofErr w:type="spellStart"/>
-      <w:r>
-        <w:t>đổi</w:t>
-      </w:r>
-      <w:proofErr w:type="spellEnd"/>
-      <w:r>
-        <w:t xml:space="preserve"> </w:t>
-      </w:r>
-      <w:proofErr w:type="spellStart"/>
-      <w:r>
-        <w:t>địa</w:t>
-      </w:r>
-      <w:proofErr w:type="spellEnd"/>
-      <w:r>
-        <w:t xml:space="preserve"> </w:t>
-      </w:r>
-      <w:proofErr w:type="spellStart"/>
-      <w:r>
-        <w:t>chỉ</w:t>
-      </w:r>
-      <w:proofErr w:type="spellEnd"/>
-      <w:r>
-        <w:t xml:space="preserve"> IP </w:t>
-      </w:r>
-      <w:proofErr w:type="spellStart"/>
-      <w:r>
-        <w:t>giữa</w:t>
-      </w:r>
-      <w:proofErr w:type="spellEnd"/>
-      <w:r>
-        <w:t xml:space="preserve"> </w:t>
-      </w:r>
-      <w:proofErr w:type="spellStart"/>
-      <w:r>
-        <w:t>các</w:t>
-      </w:r>
-      <w:proofErr w:type="spellEnd"/>
-      <w:r>
-        <w:t xml:space="preserve"> </w:t>
-      </w:r>
-      <w:proofErr w:type="spellStart"/>
-      <w:r>
-        <w:t>mạng</w:t>
-      </w:r>
-      <w:proofErr w:type="spellEnd"/>
-      <w:r>
-        <w:t xml:space="preserve">, </w:t>
-      </w:r>
-      <w:proofErr w:type="spellStart"/>
-      <w:r>
-        <w:t>giúp</w:t>
-      </w:r>
-      <w:proofErr w:type="spellEnd"/>
-      <w:r>
-        <w:t xml:space="preserve"> </w:t>
-      </w:r>
-      <w:proofErr w:type="spellStart"/>
-      <w:r>
-        <w:t>các</w:t>
-      </w:r>
-      <w:proofErr w:type="spellEnd"/>
-      <w:r>
-        <w:t xml:space="preserve"> </w:t>
-      </w:r>
-      <w:proofErr w:type="spellStart"/>
-      <w:r>
-        <w:t>máy</w:t>
-      </w:r>
-      <w:proofErr w:type="spellEnd"/>
-      <w:r>
-        <w:t xml:space="preserve"> </w:t>
-      </w:r>
-      <w:proofErr w:type="spellStart"/>
-      <w:r>
-        <w:t>trong</w:t>
-      </w:r>
-      <w:proofErr w:type="spellEnd"/>
-      <w:r>
-        <w:t xml:space="preserve"> LAN/DMZ </w:t>
-      </w:r>
-      <w:proofErr w:type="spellStart"/>
-      <w:r>
-        <w:t>truy</w:t>
-      </w:r>
-      <w:proofErr w:type="spellEnd"/>
-      <w:r>
-        <w:t xml:space="preserve"> </w:t>
-      </w:r>
-      <w:proofErr w:type="spellStart"/>
-      <w:r>
-        <w:t>cập</w:t>
-      </w:r>
-      <w:proofErr w:type="spellEnd"/>
-      <w:r>
-        <w:t xml:space="preserve"> Internet </w:t>
-      </w:r>
-      <w:proofErr w:type="spellStart"/>
-      <w:r>
-        <w:t>hoặc</w:t>
-      </w:r>
-      <w:proofErr w:type="spellEnd"/>
-      <w:r>
-        <w:t xml:space="preserve"> </w:t>
-      </w:r>
-      <w:proofErr w:type="spellStart"/>
-      <w:r>
-        <w:t>chuyển</w:t>
-      </w:r>
-      <w:proofErr w:type="spellEnd"/>
-      <w:r>
-        <w:t xml:space="preserve"> </w:t>
-      </w:r>
-      <w:proofErr w:type="spellStart"/>
-      <w:r>
-        <w:t>tiếp</w:t>
-      </w:r>
-      <w:proofErr w:type="spellEnd"/>
-      <w:r>
-        <w:t xml:space="preserve"> </w:t>
-      </w:r>
-      <w:proofErr w:type="spellStart"/>
-      <w:r>
-        <w:t>kết</w:t>
-      </w:r>
-      <w:proofErr w:type="spellEnd"/>
-      <w:r>
-        <w:t xml:space="preserve"> </w:t>
-      </w:r>
-      <w:proofErr w:type="spellStart"/>
-      <w:r>
-        <w:t>nối</w:t>
-      </w:r>
-      <w:proofErr w:type="spellEnd"/>
-      <w:r>
-        <w:t xml:space="preserve"> </w:t>
-      </w:r>
-      <w:proofErr w:type="spellStart"/>
-      <w:r>
-        <w:t>từ</w:t>
-      </w:r>
-      <w:proofErr w:type="spellEnd"/>
-      <w:r>
-        <w:t xml:space="preserve"> </w:t>
-      </w:r>
-      <w:proofErr w:type="spellStart"/>
-      <w:r>
-        <w:t>bên</w:t>
-      </w:r>
-      <w:proofErr w:type="spellEnd"/>
-      <w:r>
-        <w:t xml:space="preserve"> </w:t>
-      </w:r>
-      <w:proofErr w:type="spellStart"/>
-      <w:r>
-        <w:t>ngoài</w:t>
-      </w:r>
-      <w:proofErr w:type="spellEnd"/>
-      <w:r>
-        <w:t xml:space="preserve"> </w:t>
-      </w:r>
-      <w:proofErr w:type="spellStart"/>
-      <w:r>
-        <w:t>vào</w:t>
-      </w:r>
-      <w:proofErr w:type="spellEnd"/>
-      <w:r>
-        <w:t xml:space="preserve"> </w:t>
-      </w:r>
-      <w:proofErr w:type="spellStart"/>
-      <w:r>
-        <w:t>máy</w:t>
-      </w:r>
-      <w:proofErr w:type="spellEnd"/>
-      <w:r>
-        <w:t xml:space="preserve"> </w:t>
-      </w:r>
-      <w:proofErr w:type="spellStart"/>
-      <w:r>
-        <w:t>chủ</w:t>
-      </w:r>
-      <w:proofErr w:type="spellEnd"/>
-      <w:r>
-        <w:t xml:space="preserve"> </w:t>
-      </w:r>
-      <w:proofErr w:type="spellStart"/>
-      <w:r>
-        <w:t>nội</w:t>
-      </w:r>
-      <w:proofErr w:type="spellEnd"/>
-      <w:r>
-        <w:t xml:space="preserve"> </w:t>
-      </w:r>
-      <w:proofErr w:type="spellStart"/>
-      <w:r>
-        <w:t>bộ</w:t>
-      </w:r>
-      <w:proofErr w:type="spellEnd"/>
-      <w:r>
-        <w:t xml:space="preserve">. Firewall rule </w:t>
-      </w:r>
-      <w:proofErr w:type="spellStart"/>
-      <w:r>
-        <w:t>có</w:t>
-      </w:r>
-      <w:proofErr w:type="spellEnd"/>
-      <w:r>
-        <w:t xml:space="preserve"> </w:t>
-      </w:r>
-      <w:proofErr w:type="spellStart"/>
-      <w:r>
-        <w:t>nhiệm</w:t>
-      </w:r>
-      <w:proofErr w:type="spellEnd"/>
-      <w:r>
-        <w:t xml:space="preserve"> </w:t>
-      </w:r>
-      <w:proofErr w:type="spellStart"/>
-      <w:r>
-        <w:t>vụ</w:t>
-      </w:r>
-      <w:proofErr w:type="spellEnd"/>
-      <w:r>
-        <w:t xml:space="preserve"> </w:t>
-      </w:r>
-      <w:proofErr w:type="spellStart"/>
-      <w:r>
-        <w:t>cho</w:t>
-      </w:r>
-      <w:proofErr w:type="spellEnd"/>
-      <w:r>
-        <w:t xml:space="preserve"> </w:t>
-      </w:r>
-      <w:proofErr w:type="spellStart"/>
-      <w:r>
-        <w:t>phép</w:t>
-      </w:r>
-      <w:proofErr w:type="spellEnd"/>
-      <w:r>
-        <w:t xml:space="preserve"> </w:t>
-      </w:r>
-      <w:proofErr w:type="spellStart"/>
-      <w:r>
-        <w:t>hoặc</w:t>
-      </w:r>
-      <w:proofErr w:type="spellEnd"/>
-      <w:r>
-        <w:t xml:space="preserve"> </w:t>
-      </w:r>
-      <w:proofErr w:type="spellStart"/>
-      <w:r>
-        <w:t>chặn</w:t>
-      </w:r>
-      <w:proofErr w:type="spellEnd"/>
-      <w:r>
-        <w:t xml:space="preserve"> </w:t>
-      </w:r>
-      <w:proofErr w:type="spellStart"/>
-      <w:r>
-        <w:t>lưu</w:t>
-      </w:r>
-      <w:proofErr w:type="spellEnd"/>
-      <w:r>
-        <w:t xml:space="preserve"> </w:t>
-      </w:r>
-      <w:proofErr w:type="spellStart"/>
-      <w:r>
-        <w:t>lượng</w:t>
-      </w:r>
-      <w:proofErr w:type="spellEnd"/>
-      <w:r>
-        <w:t xml:space="preserve"> </w:t>
-      </w:r>
-      <w:proofErr w:type="spellStart"/>
-      <w:r>
-        <w:t>mạng</w:t>
-      </w:r>
-      <w:proofErr w:type="spellEnd"/>
-      <w:r>
-        <w:t xml:space="preserve"> </w:t>
-      </w:r>
-      <w:proofErr w:type="spellStart"/>
-      <w:r>
-        <w:t>dựa</w:t>
-      </w:r>
-      <w:proofErr w:type="spellEnd"/>
-      <w:r>
-        <w:t xml:space="preserve"> </w:t>
-      </w:r>
-      <w:proofErr w:type="spellStart"/>
-      <w:r>
-        <w:t>trên</w:t>
-      </w:r>
-      <w:proofErr w:type="spellEnd"/>
-      <w:r>
-        <w:t xml:space="preserve"> </w:t>
-      </w:r>
-      <w:proofErr w:type="spellStart"/>
-      <w:r>
-        <w:t>các</w:t>
-      </w:r>
-      <w:proofErr w:type="spellEnd"/>
-      <w:r>
-        <w:t xml:space="preserve"> </w:t>
-      </w:r>
-      <w:proofErr w:type="spellStart"/>
-      <w:r>
-        <w:t>điều</w:t>
-      </w:r>
-      <w:proofErr w:type="spellEnd"/>
-      <w:r>
-        <w:t xml:space="preserve"> </w:t>
-      </w:r>
-      <w:proofErr w:type="spellStart"/>
-      <w:r>
-        <w:t>kiện</w:t>
-      </w:r>
-      <w:proofErr w:type="spellEnd"/>
-      <w:r>
-        <w:t xml:space="preserve"> </w:t>
-      </w:r>
-      <w:proofErr w:type="spellStart"/>
-      <w:r>
-        <w:t>như</w:t>
-      </w:r>
-      <w:proofErr w:type="spellEnd"/>
-      <w:r>
-        <w:t xml:space="preserve"> </w:t>
-      </w:r>
-      <w:proofErr w:type="spellStart"/>
-      <w:r>
-        <w:t>địa</w:t>
-      </w:r>
-      <w:proofErr w:type="spellEnd"/>
-      <w:r>
-        <w:t xml:space="preserve"> </w:t>
-      </w:r>
-      <w:proofErr w:type="spellStart"/>
-      <w:r>
-        <w:t>chỉ</w:t>
-      </w:r>
-      <w:proofErr w:type="spellEnd"/>
-      <w:r>
-        <w:t xml:space="preserve"> IP, </w:t>
-      </w:r>
-      <w:proofErr w:type="spellStart"/>
-      <w:r>
-        <w:t>giao</w:t>
-      </w:r>
-      <w:proofErr w:type="spellEnd"/>
-      <w:r>
-        <w:t xml:space="preserve"> </w:t>
-      </w:r>
-      <w:proofErr w:type="spellStart"/>
-      <w:r>
-        <w:t>thức</w:t>
-      </w:r>
-      <w:proofErr w:type="spellEnd"/>
-      <w:r>
-        <w:t xml:space="preserve"> </w:t>
-      </w:r>
-      <w:proofErr w:type="spellStart"/>
-      <w:r>
-        <w:t>và</w:t>
-      </w:r>
-      <w:proofErr w:type="spellEnd"/>
-      <w:r>
-        <w:t xml:space="preserve"> </w:t>
-      </w:r>
-      <w:proofErr w:type="spellStart"/>
-      <w:r>
-        <w:t>cổng</w:t>
-      </w:r>
-      <w:proofErr w:type="spellEnd"/>
-      <w:r>
-        <w:t xml:space="preserve"> </w:t>
-      </w:r>
-      <w:proofErr w:type="spellStart"/>
-      <w:r>
-        <w:t>dịch</w:t>
-      </w:r>
-      <w:proofErr w:type="spellEnd"/>
-      <w:r>
-        <w:t xml:space="preserve"> </w:t>
-      </w:r>
-      <w:proofErr w:type="spellStart"/>
-      <w:r>
-        <w:t>vụ</w:t>
-      </w:r>
-      <w:proofErr w:type="spellEnd"/>
-      <w:r>
-        <w:t>.</w:t>
-      </w:r>
-    </w:p>
-    <w:p>
-      <w:r>
-        <w:rPr>
-          <w:b/>
-          <w:bCs/>
-        </w:rPr>
-        <w:t xml:space="preserve">2. </w:t>
-      </w:r>
-      <w:proofErr w:type="spellStart"/>
-      <w:r>
-        <w:rPr>
-          <w:b/>
-          <w:bCs/>
-        </w:rPr>
-        <w:t>Vì</w:t>
-      </w:r>
-      <w:proofErr w:type="spellEnd"/>
-      <w:r>
-        <w:rPr>
-          <w:b/>
-          <w:bCs/>
-        </w:rPr>
-        <w:t xml:space="preserve"> </w:t>
-      </w:r>
-      <w:proofErr w:type="spellStart"/>
-      <w:r>
-        <w:rPr>
-          <w:b/>
-          <w:bCs/>
-        </w:rPr>
-        <w:t>sao</w:t>
-      </w:r>
-      <w:proofErr w:type="spellEnd"/>
-      <w:r>
-        <w:rPr>
-          <w:b/>
-          <w:bCs/>
-        </w:rPr>
-        <w:t xml:space="preserve"> </w:t>
-      </w:r>
-      <w:proofErr w:type="spellStart"/>
-      <w:r>
-        <w:rPr>
-          <w:b/>
-          <w:bCs/>
-        </w:rPr>
-        <w:t>nên</w:t>
-      </w:r>
-      <w:proofErr w:type="spellEnd"/>
-      <w:r>
-        <w:rPr>
-          <w:b/>
-          <w:bCs/>
-        </w:rPr>
-        <w:t xml:space="preserve"> </w:t>
-      </w:r>
-      <w:proofErr w:type="spellStart"/>
-      <w:r>
-        <w:rPr>
-          <w:b/>
-          <w:bCs/>
-        </w:rPr>
-        <w:t>tách</w:t>
-      </w:r>
-      <w:proofErr w:type="spellEnd"/>
-      <w:r>
-        <w:rPr>
-          <w:b/>
-          <w:bCs/>
-        </w:rPr>
-        <w:t xml:space="preserve"> </w:t>
-      </w:r>
-      <w:proofErr w:type="spellStart"/>
-      <w:r>
-        <w:rPr>
-          <w:b/>
-          <w:bCs/>
-        </w:rPr>
-        <w:t>máy</w:t>
-      </w:r>
-      <w:proofErr w:type="spellEnd"/>
-      <w:r>
-        <w:rPr>
-          <w:b/>
-          <w:bCs/>
-        </w:rPr>
-        <w:t xml:space="preserve"> </w:t>
-      </w:r>
-      <w:proofErr w:type="spellStart"/>
-      <w:r>
-        <w:rPr>
-          <w:b/>
-          <w:bCs/>
-        </w:rPr>
-        <w:t>chủ</w:t>
-      </w:r>
-      <w:proofErr w:type="spellEnd"/>
-      <w:r>
-        <w:rPr>
-          <w:b/>
-          <w:bCs/>
-        </w:rPr>
-        <w:t xml:space="preserve"> Web/Mail/FTP </w:t>
-      </w:r>
-      <w:proofErr w:type="spellStart"/>
-      <w:r>
-        <w:rPr>
-          <w:b/>
-          <w:bCs/>
-        </w:rPr>
-        <w:t>vào</w:t>
-      </w:r>
-      <w:proofErr w:type="spellEnd"/>
-      <w:r>
-        <w:rPr>
-          <w:b/>
-          <w:bCs/>
-        </w:rPr>
-        <w:t xml:space="preserve"> DMZ </w:t>
-      </w:r>
-      <w:proofErr w:type="spellStart"/>
-      <w:r>
-        <w:rPr>
-          <w:b/>
-          <w:bCs/>
-        </w:rPr>
-        <w:t>thay</w:t>
-      </w:r>
-      <w:proofErr w:type="spellEnd"/>
-      <w:r>
-        <w:rPr>
-          <w:b/>
-          <w:bCs/>
-        </w:rPr>
-        <w:t xml:space="preserve"> </w:t>
-      </w:r>
-      <w:proofErr w:type="spellStart"/>
-      <w:r>
-        <w:rPr>
-          <w:b/>
-          <w:bCs/>
-        </w:rPr>
-        <w:t>vì</w:t>
-      </w:r>
-      <w:proofErr w:type="spellEnd"/>
-      <w:r>
-        <w:rPr>
-          <w:b/>
-          <w:bCs/>
-        </w:rPr>
-        <w:t xml:space="preserve"> </w:t>
-      </w:r>
-      <w:proofErr w:type="spellStart"/>
-      <w:r>
-        <w:rPr>
-          <w:b/>
-          <w:bCs/>
-        </w:rPr>
-        <w:t>đặt</w:t>
-      </w:r>
-      <w:proofErr w:type="spellEnd"/>
-      <w:r>
-        <w:rPr>
-          <w:b/>
-          <w:bCs/>
-        </w:rPr>
-        <w:t xml:space="preserve"> </w:t>
-      </w:r>
-      <w:proofErr w:type="spellStart"/>
-      <w:r>
-        <w:rPr>
-          <w:b/>
-          <w:bCs/>
-        </w:rPr>
-        <w:t>trong</w:t>
-      </w:r>
-      <w:proofErr w:type="spellEnd"/>
-      <w:r>
-        <w:rPr>
-          <w:b/>
-          <w:bCs/>
-        </w:rPr>
-        <w:t xml:space="preserve"> LAN?</w:t>
-      </w:r>
-      <w:r>
-        <w:br/>
-      </w:r>
-      <w:proofErr w:type="spellStart"/>
-      <w:r>
-        <w:rPr>
-          <w:b/>
-          <w:bCs/>
-        </w:rPr>
-        <w:t>Trả</w:t>
-      </w:r>
-      <w:proofErr w:type="spellEnd"/>
-      <w:r>
-        <w:rPr>
-          <w:b/>
-          <w:bCs/>
-        </w:rPr>
-        <w:t xml:space="preserve"> </w:t>
-      </w:r>
-      <w:proofErr w:type="spellStart"/>
-      <w:r>
-        <w:rPr>
-          <w:b/>
-          <w:bCs/>
-        </w:rPr>
-        <w:t>lời</w:t>
-      </w:r>
-      <w:proofErr w:type="spellEnd"/>
-      <w:r>
-        <w:rPr>
-          <w:b/>
-          <w:bCs/>
-        </w:rPr>
-        <w:t>:</w:t>
-      </w:r>
-      <w:r>
-        <w:t xml:space="preserve"> </w:t>
-      </w:r>
-      <w:proofErr w:type="spellStart"/>
-      <w:r>
-        <w:t>Vì</w:t>
-      </w:r>
-      <w:proofErr w:type="spellEnd"/>
-      <w:r>
-        <w:t xml:space="preserve"> </w:t>
-      </w:r>
-      <w:proofErr w:type="spellStart"/>
-      <w:r>
-        <w:t>các</w:t>
-      </w:r>
-      <w:proofErr w:type="spellEnd"/>
-      <w:r>
-        <w:t xml:space="preserve"> </w:t>
-      </w:r>
-      <w:proofErr w:type="spellStart"/>
-      <w:r>
-        <w:t>máy</w:t>
-      </w:r>
-      <w:proofErr w:type="spellEnd"/>
-      <w:r>
-        <w:t xml:space="preserve"> </w:t>
-      </w:r>
-      <w:proofErr w:type="spellStart"/>
-      <w:r>
-        <w:t>chủ</w:t>
-      </w:r>
-      <w:proofErr w:type="spellEnd"/>
-      <w:r>
-        <w:t xml:space="preserve"> Web/Mail/FTP </w:t>
-      </w:r>
-      <w:proofErr w:type="spellStart"/>
-      <w:r>
-        <w:t>thường</w:t>
-      </w:r>
-      <w:proofErr w:type="spellEnd"/>
-      <w:r>
-        <w:t xml:space="preserve"> </w:t>
-      </w:r>
-      <w:proofErr w:type="spellStart"/>
-      <w:r>
-        <w:t>cung</w:t>
-      </w:r>
-      <w:proofErr w:type="spellEnd"/>
-      <w:r>
-        <w:t xml:space="preserve"> </w:t>
-      </w:r>
-      <w:proofErr w:type="spellStart"/>
-      <w:r>
-        <w:t>cấp</w:t>
-      </w:r>
-      <w:proofErr w:type="spellEnd"/>
-      <w:r>
-        <w:t xml:space="preserve"> </w:t>
-      </w:r>
-      <w:proofErr w:type="spellStart"/>
-      <w:r>
-        <w:t>dịch</w:t>
-      </w:r>
-      <w:proofErr w:type="spellEnd"/>
-      <w:r>
-        <w:t xml:space="preserve"> </w:t>
-      </w:r>
-      <w:proofErr w:type="spellStart"/>
-      <w:r>
-        <w:t>vụ</w:t>
-      </w:r>
-      <w:proofErr w:type="spellEnd"/>
-      <w:r>
-        <w:t xml:space="preserve"> </w:t>
-      </w:r>
-      <w:proofErr w:type="spellStart"/>
-      <w:r>
-        <w:t>ra</w:t>
-      </w:r>
-      <w:proofErr w:type="spellEnd"/>
-      <w:r>
-        <w:t xml:space="preserve"> </w:t>
-      </w:r>
-      <w:proofErr w:type="spellStart"/>
-      <w:r>
-        <w:t>bên</w:t>
-      </w:r>
-      <w:proofErr w:type="spellEnd"/>
-      <w:r>
-        <w:t xml:space="preserve"> </w:t>
-      </w:r>
-      <w:proofErr w:type="spellStart"/>
-      <w:r>
-        <w:t>ngoài</w:t>
-      </w:r>
-      <w:proofErr w:type="spellEnd"/>
-      <w:r>
-        <w:t xml:space="preserve"> </w:t>
-      </w:r>
-      <w:proofErr w:type="spellStart"/>
-      <w:r>
-        <w:t>nên</w:t>
-      </w:r>
-      <w:proofErr w:type="spellEnd"/>
-      <w:r>
-        <w:t xml:space="preserve"> </w:t>
-      </w:r>
-      <w:proofErr w:type="spellStart"/>
-      <w:r>
-        <w:t>có</w:t>
-      </w:r>
-      <w:proofErr w:type="spellEnd"/>
-      <w:r>
-        <w:t xml:space="preserve"> </w:t>
-      </w:r>
-      <w:proofErr w:type="spellStart"/>
-      <w:r>
-        <w:t>nguy</w:t>
-      </w:r>
-      <w:proofErr w:type="spellEnd"/>
-      <w:r>
-        <w:t xml:space="preserve"> </w:t>
-      </w:r>
-      <w:proofErr w:type="spellStart"/>
-      <w:r>
-        <w:t>cơ</w:t>
-      </w:r>
-      <w:proofErr w:type="spellEnd"/>
-      <w:r>
-        <w:t xml:space="preserve"> </w:t>
-      </w:r>
-      <w:proofErr w:type="spellStart"/>
-      <w:r>
-        <w:t>bị</w:t>
-      </w:r>
-      <w:proofErr w:type="spellEnd"/>
-      <w:r>
-        <w:t xml:space="preserve"> </w:t>
-      </w:r>
-      <w:proofErr w:type="spellStart"/>
-      <w:r>
-        <w:t>tấn</w:t>
-      </w:r>
-      <w:proofErr w:type="spellEnd"/>
-      <w:r>
-        <w:t xml:space="preserve"> </w:t>
-      </w:r>
-      <w:proofErr w:type="spellStart"/>
-      <w:r>
-        <w:t>công</w:t>
-      </w:r>
-      <w:proofErr w:type="spellEnd"/>
-      <w:r>
-        <w:t xml:space="preserve"> </w:t>
-      </w:r>
-      <w:proofErr w:type="spellStart"/>
-      <w:r>
-        <w:t>cao</w:t>
-      </w:r>
-      <w:proofErr w:type="spellEnd"/>
-      <w:r>
-        <w:t xml:space="preserve">. </w:t>
-      </w:r>
-      <w:proofErr w:type="spellStart"/>
-      <w:r>
-        <w:t>Đặt</w:t>
-      </w:r>
-      <w:proofErr w:type="spellEnd"/>
-      <w:r>
-        <w:t xml:space="preserve"> </w:t>
-      </w:r>
-      <w:proofErr w:type="spellStart"/>
-      <w:r>
-        <w:t>chúng</w:t>
-      </w:r>
-      <w:proofErr w:type="spellEnd"/>
-      <w:r>
-        <w:t xml:space="preserve"> </w:t>
-      </w:r>
-      <w:proofErr w:type="spellStart"/>
-      <w:r>
-        <w:t>trong</w:t>
-      </w:r>
-      <w:proofErr w:type="spellEnd"/>
-      <w:r>
-        <w:t xml:space="preserve"> DMZ </w:t>
-      </w:r>
-      <w:proofErr w:type="spellStart"/>
-      <w:r>
-        <w:t>giúp</w:t>
-      </w:r>
-      <w:proofErr w:type="spellEnd"/>
-      <w:r>
-        <w:t xml:space="preserve"> </w:t>
-      </w:r>
-      <w:proofErr w:type="spellStart"/>
-      <w:r>
-        <w:t>cách</w:t>
-      </w:r>
-      <w:proofErr w:type="spellEnd"/>
-      <w:r>
-        <w:t xml:space="preserve"> </w:t>
-      </w:r>
-      <w:proofErr w:type="spellStart"/>
-      <w:r>
-        <w:t>ly</w:t>
-      </w:r>
-      <w:proofErr w:type="spellEnd"/>
-      <w:r>
-        <w:t xml:space="preserve"> </w:t>
-      </w:r>
-      <w:proofErr w:type="spellStart"/>
-      <w:r>
-        <w:t>với</w:t>
-      </w:r>
-      <w:proofErr w:type="spellEnd"/>
-      <w:r>
-        <w:t xml:space="preserve"> </w:t>
-      </w:r>
-      <w:proofErr w:type="spellStart"/>
-      <w:r>
-        <w:t>mạng</w:t>
-      </w:r>
-      <w:proofErr w:type="spellEnd"/>
-      <w:r>
-        <w:t xml:space="preserve"> LAN, </w:t>
-      </w:r>
-      <w:proofErr w:type="spellStart"/>
-      <w:r>
-        <w:t>hạn</w:t>
-      </w:r>
-      <w:proofErr w:type="spellEnd"/>
-      <w:r>
-        <w:t xml:space="preserve"> </w:t>
-      </w:r>
-      <w:proofErr w:type="spellStart"/>
-      <w:r>
-        <w:t>chế</w:t>
-      </w:r>
-      <w:proofErr w:type="spellEnd"/>
-      <w:r>
-        <w:t xml:space="preserve"> </w:t>
-      </w:r>
-      <w:proofErr w:type="spellStart"/>
-      <w:r>
-        <w:t>kẻ</w:t>
-      </w:r>
-      <w:proofErr w:type="spellEnd"/>
-      <w:r>
-        <w:t xml:space="preserve"> </w:t>
-      </w:r>
-      <w:proofErr w:type="spellStart"/>
-      <w:r>
-        <w:t>tấn</w:t>
-      </w:r>
-      <w:proofErr w:type="spellEnd"/>
-      <w:r>
-        <w:t xml:space="preserve"> </w:t>
-      </w:r>
-      <w:proofErr w:type="spellStart"/>
-      <w:r>
-        <w:t>công</w:t>
-      </w:r>
-      <w:proofErr w:type="spellEnd"/>
-      <w:r>
-        <w:t xml:space="preserve"> </w:t>
-      </w:r>
-      <w:proofErr w:type="spellStart"/>
-      <w:r>
-        <w:t>truy</w:t>
-      </w:r>
-      <w:proofErr w:type="spellEnd"/>
-      <w:r>
-        <w:t xml:space="preserve"> </w:t>
-      </w:r>
-      <w:proofErr w:type="spellStart"/>
-      <w:r>
-        <w:t>cập</w:t>
-      </w:r>
-      <w:proofErr w:type="spellEnd"/>
-      <w:r>
-        <w:t xml:space="preserve"> </w:t>
-      </w:r>
-      <w:proofErr w:type="spellStart"/>
-      <w:r>
-        <w:t>vào</w:t>
-      </w:r>
-      <w:proofErr w:type="spellEnd"/>
-      <w:r>
-        <w:t xml:space="preserve"> </w:t>
-      </w:r>
-      <w:proofErr w:type="spellStart"/>
-      <w:r>
-        <w:t>mạng</w:t>
-      </w:r>
-      <w:proofErr w:type="spellEnd"/>
-      <w:r>
-        <w:t xml:space="preserve"> </w:t>
-      </w:r>
-      <w:proofErr w:type="spellStart"/>
-      <w:r>
-        <w:t>nội</w:t>
-      </w:r>
-      <w:proofErr w:type="spellEnd"/>
-      <w:r>
-        <w:t xml:space="preserve"> </w:t>
-      </w:r>
-      <w:proofErr w:type="spellStart"/>
-      <w:r>
-        <w:t>bộ</w:t>
-      </w:r>
-      <w:proofErr w:type="spellEnd"/>
-      <w:r>
-        <w:t xml:space="preserve"> </w:t>
-      </w:r>
-      <w:proofErr w:type="spellStart"/>
-      <w:r>
-        <w:t>nếu</w:t>
-      </w:r>
-      <w:proofErr w:type="spellEnd"/>
-      <w:r>
-        <w:t xml:space="preserve"> </w:t>
-      </w:r>
-      <w:proofErr w:type="spellStart"/>
-      <w:r>
-        <w:t>máy</w:t>
-      </w:r>
-      <w:proofErr w:type="spellEnd"/>
-      <w:r>
-        <w:t xml:space="preserve"> </w:t>
-      </w:r>
-      <w:proofErr w:type="spellStart"/>
-      <w:r>
-        <w:t>chủ</w:t>
-      </w:r>
-      <w:proofErr w:type="spellEnd"/>
-      <w:r>
-        <w:t xml:space="preserve"> </w:t>
-      </w:r>
-      <w:proofErr w:type="spellStart"/>
-      <w:r>
-        <w:t>bị</w:t>
-      </w:r>
-      <w:proofErr w:type="spellEnd"/>
-      <w:r>
-        <w:t xml:space="preserve"> </w:t>
-      </w:r>
-      <w:proofErr w:type="spellStart"/>
-      <w:r>
-        <w:t>xâm</w:t>
-      </w:r>
-      <w:proofErr w:type="spellEnd"/>
-      <w:r>
-        <w:t xml:space="preserve"> </w:t>
-      </w:r>
-      <w:proofErr w:type="spellStart"/>
-      <w:r>
-        <w:t>nhập</w:t>
-      </w:r>
-      <w:proofErr w:type="spellEnd"/>
-      <w:r>
-        <w:t>.</w:t>
-      </w:r>
-    </w:p>
-    <w:p>
-      <w:r>
-        <w:rPr>
-          <w:b/>
-          <w:bCs/>
-        </w:rPr>
-        <w:t xml:space="preserve">3. </w:t>
-      </w:r>
-      <w:proofErr w:type="spellStart"/>
-      <w:r>
-        <w:rPr>
-          <w:b/>
-          <w:bCs/>
-        </w:rPr>
-        <w:t>Nếu</w:t>
-      </w:r>
-      <w:proofErr w:type="spellEnd"/>
-      <w:r>
-        <w:rPr>
-          <w:b/>
-          <w:bCs/>
-        </w:rPr>
-        <w:t xml:space="preserve"> rule Block </w:t>
-      </w:r>
-      <w:proofErr w:type="spellStart"/>
-      <w:r>
-        <w:rPr>
-          <w:b/>
-          <w:bCs/>
-        </w:rPr>
-        <w:t>nằm</w:t>
-      </w:r>
-      <w:proofErr w:type="spellEnd"/>
-      <w:r>
-        <w:rPr>
-          <w:b/>
-          <w:bCs/>
-        </w:rPr>
-        <w:t xml:space="preserve"> </w:t>
-      </w:r>
-      <w:proofErr w:type="spellStart"/>
-      <w:r>
-        <w:rPr>
-          <w:b/>
-          <w:bCs/>
-        </w:rPr>
-        <w:t>dưới</w:t>
-      </w:r>
-      <w:proofErr w:type="spellEnd"/>
-      <w:r>
-        <w:rPr>
-          <w:b/>
-          <w:bCs/>
-        </w:rPr>
-        <w:t xml:space="preserve"> </w:t>
-      </w:r>
-      <w:proofErr w:type="spellStart"/>
-      <w:r>
-        <w:rPr>
-          <w:b/>
-          <w:bCs/>
-        </w:rPr>
-        <w:t>một</w:t>
-      </w:r>
-      <w:proofErr w:type="spellEnd"/>
-      <w:r>
-        <w:rPr>
-          <w:b/>
-          <w:bCs/>
-        </w:rPr>
-        <w:t xml:space="preserve"> rule Pass </w:t>
-      </w:r>
-      <w:proofErr w:type="spellStart"/>
-      <w:r>
-        <w:rPr>
-          <w:b/>
-          <w:bCs/>
-        </w:rPr>
-        <w:t>tổng</w:t>
-      </w:r>
-      <w:proofErr w:type="spellEnd"/>
-      <w:r>
-        <w:rPr>
-          <w:b/>
-          <w:bCs/>
-        </w:rPr>
-        <w:t xml:space="preserve"> </w:t>
-      </w:r>
-      <w:proofErr w:type="spellStart"/>
-      <w:r>
-        <w:rPr>
-          <w:b/>
-          <w:bCs/>
-        </w:rPr>
-        <w:t>quát</w:t>
-      </w:r>
-      <w:proofErr w:type="spellEnd"/>
-      <w:r>
-        <w:rPr>
-          <w:b/>
-          <w:bCs/>
-        </w:rPr>
-        <w:t xml:space="preserve"> </w:t>
-      </w:r>
-      <w:proofErr w:type="spellStart"/>
-      <w:r>
-        <w:rPr>
-          <w:b/>
-          <w:bCs/>
-        </w:rPr>
-        <w:t>thì</w:t>
-      </w:r>
-      <w:proofErr w:type="spellEnd"/>
-      <w:r>
-        <w:rPr>
-          <w:b/>
-          <w:bCs/>
-        </w:rPr>
-        <w:t xml:space="preserve"> </w:t>
-      </w:r>
-      <w:proofErr w:type="spellStart"/>
-      <w:r>
-        <w:rPr>
-          <w:b/>
-          <w:bCs/>
-        </w:rPr>
-        <w:t>kết</w:t>
-      </w:r>
-      <w:proofErr w:type="spellEnd"/>
-      <w:r>
-        <w:rPr>
-          <w:b/>
-          <w:bCs/>
-        </w:rPr>
-        <w:t xml:space="preserve"> </w:t>
-      </w:r>
-      <w:proofErr w:type="spellStart"/>
-      <w:r>
-        <w:rPr>
-          <w:b/>
-          <w:bCs/>
-        </w:rPr>
-        <w:t>quả</w:t>
-      </w:r>
-      <w:proofErr w:type="spellEnd"/>
-      <w:r>
-        <w:rPr>
-          <w:b/>
-          <w:bCs/>
-        </w:rPr>
-        <w:t xml:space="preserve"> </w:t>
-      </w:r>
-      <w:proofErr w:type="spellStart"/>
-      <w:r>
-        <w:rPr>
-          <w:b/>
-          <w:bCs/>
-        </w:rPr>
-        <w:t>có</w:t>
-      </w:r>
-      <w:proofErr w:type="spellEnd"/>
-      <w:r>
-        <w:rPr>
-          <w:b/>
-          <w:bCs/>
-        </w:rPr>
-        <w:t xml:space="preserve"> </w:t>
-      </w:r>
-      <w:proofErr w:type="spellStart"/>
-      <w:r>
-        <w:rPr>
-          <w:b/>
-          <w:bCs/>
-        </w:rPr>
-        <w:t>thể</w:t>
-      </w:r>
-      <w:proofErr w:type="spellEnd"/>
-      <w:r>
-        <w:rPr>
-          <w:b/>
-          <w:bCs/>
-        </w:rPr>
-        <w:t xml:space="preserve"> </w:t>
-      </w:r>
-      <w:proofErr w:type="spellStart"/>
-      <w:r>
-        <w:rPr>
-          <w:b/>
-          <w:bCs/>
-        </w:rPr>
-        <w:t>như</w:t>
-      </w:r>
-      <w:proofErr w:type="spellEnd"/>
-      <w:r>
-        <w:rPr>
-          <w:b/>
-          <w:bCs/>
-        </w:rPr>
-        <w:t xml:space="preserve"> </w:t>
-      </w:r>
-      <w:proofErr w:type="spellStart"/>
-      <w:r>
-        <w:rPr>
-          <w:b/>
-          <w:bCs/>
-        </w:rPr>
-        <w:t>thế</w:t>
-      </w:r>
-      <w:proofErr w:type="spellEnd"/>
-      <w:r>
-        <w:rPr>
-          <w:b/>
-          <w:bCs/>
-        </w:rPr>
-        <w:t xml:space="preserve"> </w:t>
-      </w:r>
-      <w:proofErr w:type="spellStart"/>
-      <w:r>
-        <w:rPr>
-          <w:b/>
-          <w:bCs/>
-        </w:rPr>
-        <w:t>nào</w:t>
-      </w:r>
-      <w:proofErr w:type="spellEnd"/>
-      <w:r>
-        <w:rPr>
-          <w:b/>
-          <w:bCs/>
-        </w:rPr>
-        <w:t>?</w:t>
-      </w:r>
-      <w:r>
-        <w:br/>
-      </w:r>
-      <w:proofErr w:type="spellStart"/>
-      <w:r>
-        <w:rPr>
-          <w:b/>
-          <w:bCs/>
-        </w:rPr>
-        <w:t>Trả</w:t>
-      </w:r>
-      <w:proofErr w:type="spellEnd"/>
-      <w:r>
-        <w:rPr>
-          <w:b/>
-          <w:bCs/>
-        </w:rPr>
-        <w:t xml:space="preserve"> </w:t>
-      </w:r>
-      <w:proofErr w:type="spellStart"/>
-      <w:r>
-        <w:rPr>
-          <w:b/>
-          <w:bCs/>
-        </w:rPr>
-        <w:t>lời</w:t>
-      </w:r>
-      <w:proofErr w:type="spellEnd"/>
-      <w:r>
-        <w:rPr>
-          <w:b/>
-          <w:bCs/>
-        </w:rPr>
-        <w:t>:</w:t>
-      </w:r>
-      <w:r>
-        <w:t xml:space="preserve"> Firewall </w:t>
-      </w:r>
-      <w:proofErr w:type="spellStart"/>
-      <w:r>
-        <w:t>xử</w:t>
-      </w:r>
-      <w:proofErr w:type="spellEnd"/>
-      <w:r>
-        <w:t xml:space="preserve"> </w:t>
-      </w:r>
-      <w:proofErr w:type="spellStart"/>
-      <w:r>
-        <w:t>lý</w:t>
-      </w:r>
-      <w:proofErr w:type="spellEnd"/>
-      <w:r>
-        <w:t xml:space="preserve"> </w:t>
-      </w:r>
-      <w:proofErr w:type="spellStart"/>
-      <w:r>
-        <w:t>các</w:t>
-      </w:r>
-      <w:proofErr w:type="spellEnd"/>
-      <w:r>
-        <w:t xml:space="preserve"> rule </w:t>
-      </w:r>
-      <w:proofErr w:type="spellStart"/>
-      <w:r>
-        <w:t>theo</w:t>
-      </w:r>
-      <w:proofErr w:type="spellEnd"/>
-      <w:r>
-        <w:t xml:space="preserve"> </w:t>
-      </w:r>
-      <w:proofErr w:type="spellStart"/>
-      <w:r>
-        <w:t>thứ</w:t>
-      </w:r>
-      <w:proofErr w:type="spellEnd"/>
-      <w:r>
-        <w:t xml:space="preserve"> </w:t>
-      </w:r>
-      <w:proofErr w:type="spellStart"/>
-      <w:r>
-        <w:t>tự</w:t>
-      </w:r>
-      <w:proofErr w:type="spellEnd"/>
-      <w:r>
-        <w:t xml:space="preserve"> </w:t>
-      </w:r>
-      <w:proofErr w:type="spellStart"/>
-      <w:r>
-        <w:t>từ</w:t>
-      </w:r>
-      <w:proofErr w:type="spellEnd"/>
-      <w:r>
-        <w:t xml:space="preserve"> </w:t>
-      </w:r>
-      <w:proofErr w:type="spellStart"/>
-      <w:r>
-        <w:t>trên</w:t>
-      </w:r>
-      <w:proofErr w:type="spellEnd"/>
-      <w:r>
-        <w:t xml:space="preserve"> </w:t>
-      </w:r>
-      <w:proofErr w:type="spellStart"/>
-      <w:r>
-        <w:t>xuống</w:t>
-      </w:r>
-      <w:proofErr w:type="spellEnd"/>
-      <w:r>
-        <w:t xml:space="preserve">. </w:t>
-      </w:r>
-      <w:proofErr w:type="spellStart"/>
-      <w:r>
-        <w:t>Nếu</w:t>
-      </w:r>
-      <w:proofErr w:type="spellEnd"/>
-      <w:r>
-        <w:t xml:space="preserve"> </w:t>
-      </w:r>
-      <w:proofErr w:type="spellStart"/>
-      <w:r>
-        <w:t>lưu</w:t>
-      </w:r>
-      <w:proofErr w:type="spellEnd"/>
-      <w:r>
-        <w:t xml:space="preserve"> </w:t>
-      </w:r>
-      <w:proofErr w:type="spellStart"/>
-      <w:r>
-        <w:t>lượng</w:t>
-      </w:r>
-      <w:proofErr w:type="spellEnd"/>
-      <w:r>
-        <w:t xml:space="preserve"> </w:t>
-      </w:r>
-      <w:proofErr w:type="spellStart"/>
-      <w:r>
-        <w:t>đã</w:t>
-      </w:r>
-      <w:proofErr w:type="spellEnd"/>
-      <w:r>
-        <w:t xml:space="preserve"> </w:t>
-      </w:r>
-      <w:proofErr w:type="spellStart"/>
-      <w:r>
-        <w:t>khớp</w:t>
-      </w:r>
-      <w:proofErr w:type="spellEnd"/>
-      <w:r>
-        <w:t xml:space="preserve"> </w:t>
-      </w:r>
-      <w:proofErr w:type="spellStart"/>
-      <w:r>
-        <w:t>với</w:t>
-      </w:r>
-      <w:proofErr w:type="spellEnd"/>
-      <w:r>
-        <w:t xml:space="preserve"> rule Pass </w:t>
-      </w:r>
-      <w:proofErr w:type="spellStart"/>
-      <w:r>
-        <w:t>tổng</w:t>
-      </w:r>
-      <w:proofErr w:type="spellEnd"/>
-      <w:r>
-        <w:t xml:space="preserve"> </w:t>
-      </w:r>
-      <w:proofErr w:type="spellStart"/>
-      <w:r>
-        <w:t>quát</w:t>
-      </w:r>
-      <w:proofErr w:type="spellEnd"/>
-      <w:r>
-        <w:t xml:space="preserve"> ở </w:t>
-      </w:r>
-      <w:proofErr w:type="spellStart"/>
-      <w:r>
-        <w:t>phía</w:t>
-      </w:r>
-      <w:proofErr w:type="spellEnd"/>
-      <w:r>
-        <w:t xml:space="preserve"> </w:t>
-      </w:r>
-      <w:proofErr w:type="spellStart"/>
-      <w:r>
-        <w:t>trên</w:t>
-      </w:r>
-      <w:proofErr w:type="spellEnd"/>
-      <w:r>
-        <w:t xml:space="preserve"> </w:t>
-      </w:r>
-      <w:proofErr w:type="spellStart"/>
-      <w:r>
-        <w:t>thì</w:t>
-      </w:r>
-      <w:proofErr w:type="spellEnd"/>
-      <w:r>
-        <w:t xml:space="preserve"> </w:t>
-      </w:r>
-      <w:proofErr w:type="spellStart"/>
-      <w:r>
-        <w:t>sẽ</w:t>
-      </w:r>
-      <w:proofErr w:type="spellEnd"/>
-      <w:r>
-        <w:t xml:space="preserve"> </w:t>
-      </w:r>
-      <w:proofErr w:type="spellStart"/>
-      <w:r>
-        <w:t>được</w:t>
-      </w:r>
-      <w:proofErr w:type="spellEnd"/>
-      <w:r>
-        <w:t xml:space="preserve"> </w:t>
-      </w:r>
-      <w:proofErr w:type="spellStart"/>
-      <w:r>
-        <w:t>cho</w:t>
-      </w:r>
-      <w:proofErr w:type="spellEnd"/>
-      <w:r>
-        <w:t xml:space="preserve"> </w:t>
-      </w:r>
-      <w:proofErr w:type="spellStart"/>
-      <w:r>
-        <w:t>phép</w:t>
-      </w:r>
-      <w:proofErr w:type="spellEnd"/>
-      <w:r>
-        <w:t xml:space="preserve"> </w:t>
-      </w:r>
-      <w:proofErr w:type="spellStart"/>
-      <w:r>
-        <w:t>và</w:t>
-      </w:r>
-      <w:proofErr w:type="spellEnd"/>
-      <w:r>
-        <w:t xml:space="preserve"> rule Block </w:t>
-      </w:r>
-      <w:proofErr w:type="spellStart"/>
-      <w:r>
-        <w:t>phía</w:t>
-      </w:r>
-      <w:proofErr w:type="spellEnd"/>
-      <w:r>
-        <w:t xml:space="preserve"> </w:t>
-      </w:r>
-      <w:proofErr w:type="spellStart"/>
-      <w:r>
-        <w:t>dưới</w:t>
-      </w:r>
-      <w:proofErr w:type="spellEnd"/>
-      <w:r>
-        <w:t xml:space="preserve"> </w:t>
-      </w:r>
-      <w:proofErr w:type="spellStart"/>
-      <w:r>
-        <w:t>không</w:t>
-      </w:r>
-      <w:proofErr w:type="spellEnd"/>
-      <w:r>
-        <w:t xml:space="preserve"> </w:t>
-      </w:r>
-      <w:proofErr w:type="spellStart"/>
-      <w:r>
-        <w:t>còn</w:t>
-      </w:r>
-      <w:proofErr w:type="spellEnd"/>
-      <w:r>
-        <w:t xml:space="preserve"> </w:t>
-      </w:r>
-      <w:proofErr w:type="spellStart"/>
-      <w:r>
-        <w:t>tác</w:t>
-      </w:r>
-      <w:proofErr w:type="spellEnd"/>
-      <w:r>
-        <w:t xml:space="preserve"> </w:t>
-      </w:r>
-      <w:proofErr w:type="spellStart"/>
-      <w:r>
-        <w:t>dụng</w:t>
-      </w:r>
-      <w:proofErr w:type="spellEnd"/>
-      <w:r>
-        <w:t xml:space="preserve"> </w:t>
-      </w:r>
-      <w:proofErr w:type="spellStart"/>
-      <w:r>
-        <w:t>đối</w:t>
-      </w:r>
-      <w:proofErr w:type="spellEnd"/>
-      <w:r>
-        <w:t xml:space="preserve"> </w:t>
-      </w:r>
-      <w:proofErr w:type="spellStart"/>
-      <w:r>
-        <w:t>với</w:t>
-      </w:r>
-      <w:proofErr w:type="spellEnd"/>
-      <w:r>
-        <w:t xml:space="preserve"> </w:t>
-      </w:r>
-      <w:proofErr w:type="spellStart"/>
-      <w:r>
-        <w:t>lưu</w:t>
-      </w:r>
-      <w:proofErr w:type="spellEnd"/>
-      <w:r>
-        <w:t xml:space="preserve"> </w:t>
-      </w:r>
-      <w:proofErr w:type="spellStart"/>
-      <w:r>
-        <w:t>lượng</w:t>
-      </w:r>
-      <w:proofErr w:type="spellEnd"/>
-      <w:r>
-        <w:t xml:space="preserve"> </w:t>
-      </w:r>
-      <w:proofErr w:type="spellStart"/>
-      <w:r>
-        <w:t>đó</w:t>
-      </w:r>
-      <w:proofErr w:type="spellEnd"/>
-      <w:r>
-        <w:t>.</w:t>
-      </w:r>
-    </w:p>
-    <w:p>
-      <w:r>
-        <w:rPr>
-          <w:b/>
-          <w:bCs/>
-        </w:rPr>
-        <w:t xml:space="preserve">4. </w:t>
-      </w:r>
-      <w:proofErr w:type="spellStart"/>
-      <w:r>
-        <w:rPr>
-          <w:b/>
-          <w:bCs/>
-        </w:rPr>
-        <w:t>Muốn</w:t>
-      </w:r>
-      <w:proofErr w:type="spellEnd"/>
-      <w:r>
-        <w:rPr>
-          <w:b/>
-          <w:bCs/>
-        </w:rPr>
-        <w:t xml:space="preserve"> </w:t>
-      </w:r>
-      <w:proofErr w:type="spellStart"/>
-      <w:r>
-        <w:rPr>
-          <w:b/>
-          <w:bCs/>
-        </w:rPr>
-        <w:t>chặn</w:t>
-      </w:r>
-      <w:proofErr w:type="spellEnd"/>
-      <w:r>
-        <w:rPr>
-          <w:b/>
-          <w:bCs/>
-        </w:rPr>
-        <w:t xml:space="preserve"> ping </w:t>
-      </w:r>
-      <w:proofErr w:type="spellStart"/>
-      <w:r>
-        <w:rPr>
-          <w:b/>
-          <w:bCs/>
-        </w:rPr>
-        <w:t>nhưng</w:t>
-      </w:r>
-      <w:proofErr w:type="spellEnd"/>
-      <w:r>
-        <w:rPr>
-          <w:b/>
-          <w:bCs/>
-        </w:rPr>
-        <w:t xml:space="preserve"> </w:t>
-      </w:r>
-      <w:proofErr w:type="spellStart"/>
-      <w:r>
-        <w:rPr>
-          <w:b/>
-          <w:bCs/>
-        </w:rPr>
-        <w:t>vẫn</w:t>
-      </w:r>
-      <w:proofErr w:type="spellEnd"/>
-      <w:r>
-        <w:rPr>
-          <w:b/>
-          <w:bCs/>
-        </w:rPr>
-        <w:t xml:space="preserve"> </w:t>
-      </w:r>
-      <w:proofErr w:type="spellStart"/>
-      <w:r>
-        <w:rPr>
-          <w:b/>
-          <w:bCs/>
-        </w:rPr>
-        <w:t>cho</w:t>
-      </w:r>
-      <w:proofErr w:type="spellEnd"/>
-      <w:r>
-        <w:rPr>
-          <w:b/>
-          <w:bCs/>
-        </w:rPr>
-        <w:t xml:space="preserve"> </w:t>
-      </w:r>
-      <w:proofErr w:type="spellStart"/>
-      <w:r>
-        <w:rPr>
-          <w:b/>
-          <w:bCs/>
-        </w:rPr>
-        <w:t>truy</w:t>
-      </w:r>
-      <w:proofErr w:type="spellEnd"/>
-      <w:r>
-        <w:rPr>
-          <w:b/>
-          <w:bCs/>
-        </w:rPr>
-        <w:t xml:space="preserve"> </w:t>
-      </w:r>
-      <w:proofErr w:type="spellStart"/>
-      <w:r>
-        <w:rPr>
-          <w:b/>
-          <w:bCs/>
-        </w:rPr>
-        <w:t>cập</w:t>
-      </w:r>
-      <w:proofErr w:type="spellEnd"/>
-      <w:r>
-        <w:rPr>
-          <w:b/>
-          <w:bCs/>
-        </w:rPr>
-        <w:t xml:space="preserve"> web, </w:t>
-      </w:r>
-      <w:proofErr w:type="spellStart"/>
-      <w:r>
-        <w:rPr>
-          <w:b/>
-          <w:bCs/>
-        </w:rPr>
-        <w:t>cần</w:t>
-      </w:r>
-      <w:proofErr w:type="spellEnd"/>
-      <w:r>
-        <w:rPr>
-          <w:b/>
-          <w:bCs/>
-        </w:rPr>
-        <w:t xml:space="preserve"> </w:t>
-      </w:r>
-      <w:proofErr w:type="spellStart"/>
-      <w:r>
-        <w:rPr>
-          <w:b/>
-          <w:bCs/>
-        </w:rPr>
-        <w:t>cấu</w:t>
-      </w:r>
-      <w:proofErr w:type="spellEnd"/>
-      <w:r>
-        <w:rPr>
-          <w:b/>
-          <w:bCs/>
-        </w:rPr>
-        <w:t xml:space="preserve"> </w:t>
-      </w:r>
-      <w:proofErr w:type="spellStart"/>
-      <w:r>
-        <w:rPr>
-          <w:b/>
-          <w:bCs/>
-        </w:rPr>
-        <w:t>hình</w:t>
-      </w:r>
-      <w:proofErr w:type="spellEnd"/>
-      <w:r>
-        <w:rPr>
-          <w:b/>
-          <w:bCs/>
-        </w:rPr>
-        <w:t xml:space="preserve"> </w:t>
-      </w:r>
-      <w:proofErr w:type="spellStart"/>
-      <w:r>
-        <w:rPr>
-          <w:b/>
-          <w:bCs/>
-        </w:rPr>
-        <w:t>các</w:t>
-      </w:r>
-      <w:proofErr w:type="spellEnd"/>
-      <w:r>
-        <w:rPr>
-          <w:b/>
-          <w:bCs/>
-        </w:rPr>
-        <w:t xml:space="preserve"> rule </w:t>
-      </w:r>
-      <w:proofErr w:type="spellStart"/>
-      <w:r>
-        <w:rPr>
-          <w:b/>
-          <w:bCs/>
-        </w:rPr>
-        <w:t>nào</w:t>
-      </w:r>
-      <w:proofErr w:type="spellEnd"/>
-      <w:r>
-        <w:rPr>
-          <w:b/>
-          <w:bCs/>
-        </w:rPr>
-        <w:t>?</w:t>
-      </w:r>
-      <w:r>
-        <w:br/>
-      </w:r>
-      <w:proofErr w:type="spellStart"/>
-      <w:r>
-        <w:rPr>
-          <w:b/>
-          <w:bCs/>
-        </w:rPr>
-        <w:t>Trả</w:t>
-      </w:r>
-      <w:proofErr w:type="spellEnd"/>
-      <w:r>
-        <w:rPr>
-          <w:b/>
-          <w:bCs/>
-        </w:rPr>
-        <w:t xml:space="preserve"> </w:t>
-      </w:r>
-      <w:proofErr w:type="spellStart"/>
-      <w:r>
-        <w:rPr>
-          <w:b/>
-          <w:bCs/>
-        </w:rPr>
-        <w:t>lời</w:t>
-      </w:r>
-      <w:proofErr w:type="spellEnd"/>
-      <w:r>
-        <w:rPr>
-          <w:b/>
-          <w:bCs/>
-        </w:rPr>
-        <w:t>:</w:t>
-      </w:r>
-      <w:r>
-        <w:t xml:space="preserve"> </w:t>
-      </w:r>
-      <w:proofErr w:type="spellStart"/>
-      <w:r>
-        <w:t>Tạo</w:t>
-      </w:r>
-      <w:proofErr w:type="spellEnd"/>
-      <w:r>
-        <w:t xml:space="preserve"> rule </w:t>
+        <w:t>Trả lời:</w:t>
+      </w:r>
+      <w:r>
+        <w:t xml:space="preserve"> Tạo rule </w:t>
       </w:r>
       <w:r>
         <w:rPr>
@@ -5158,39 +3139,7 @@
         <w:t>Block ICMP</w:t>
       </w:r>
       <w:r>
-        <w:t xml:space="preserve"> </w:t>
-      </w:r>
-      <w:proofErr w:type="spellStart"/>
-      <w:r>
-        <w:t>để</w:t>
-      </w:r>
-      <w:proofErr w:type="spellEnd"/>
-      <w:r>
-        <w:t xml:space="preserve"> </w:t>
-      </w:r>
-      <w:proofErr w:type="spellStart"/>
-      <w:r>
-        <w:t>chặn</w:t>
-      </w:r>
-      <w:proofErr w:type="spellEnd"/>
-      <w:r>
-        <w:t xml:space="preserve"> ping </w:t>
-      </w:r>
-      <w:proofErr w:type="spellStart"/>
-      <w:r>
-        <w:t>và</w:t>
-      </w:r>
-      <w:proofErr w:type="spellEnd"/>
-      <w:r>
-        <w:t xml:space="preserve"> </w:t>
-      </w:r>
-      <w:proofErr w:type="spellStart"/>
-      <w:r>
-        <w:t>tạo</w:t>
-      </w:r>
-      <w:proofErr w:type="spellEnd"/>
-      <w:r>
-        <w:t xml:space="preserve"> rule </w:t>
+        <w:t xml:space="preserve"> để chặn ping và tạo rule </w:t>
       </w:r>
       <w:r>
         <w:rPr>
@@ -5200,39 +3149,7 @@
         <w:t>Pass TCP</w:t>
       </w:r>
       <w:r>
-        <w:t xml:space="preserve"> </w:t>
-      </w:r>
-      <w:proofErr w:type="spellStart"/>
-      <w:r>
-        <w:t>cho</w:t>
-      </w:r>
-      <w:proofErr w:type="spellEnd"/>
-      <w:r>
-        <w:t xml:space="preserve"> </w:t>
-      </w:r>
-      <w:proofErr w:type="spellStart"/>
-      <w:r>
-        <w:t>các</w:t>
-      </w:r>
-      <w:proofErr w:type="spellEnd"/>
-      <w:r>
-        <w:t xml:space="preserve"> </w:t>
-      </w:r>
-      <w:proofErr w:type="spellStart"/>
-      <w:r>
-        <w:t>cổng</w:t>
-      </w:r>
-      <w:proofErr w:type="spellEnd"/>
-      <w:r>
-        <w:t xml:space="preserve"> Web </w:t>
-      </w:r>
-      <w:proofErr w:type="spellStart"/>
-      <w:r>
-        <w:t>như</w:t>
-      </w:r>
-      <w:proofErr w:type="spellEnd"/>
-      <w:r>
-        <w:t xml:space="preserve"> </w:t>
+        <w:t xml:space="preserve"> cho các cổng Web như </w:t>
       </w:r>
       <w:r>
         <w:rPr>
@@ -5242,15 +3159,7 @@
         <w:t>HTTP (80)</w:t>
       </w:r>
       <w:r>
-        <w:t xml:space="preserve"> </w:t>
-      </w:r>
-      <w:proofErr w:type="spellStart"/>
-      <w:r>
-        <w:t>và</w:t>
-      </w:r>
-      <w:proofErr w:type="spellEnd"/>
-      <w:r>
-        <w:t xml:space="preserve"> </w:t>
+        <w:t xml:space="preserve"> và </w:t>
       </w:r>
       <w:r>
         <w:rPr>
@@ -5260,167 +3169,7 @@
         <w:t>HTTPS (443)</w:t>
       </w:r>
       <w:r>
-        <w:t xml:space="preserve">. Rule </w:t>
-      </w:r>
-      <w:proofErr w:type="spellStart"/>
-      <w:r>
-        <w:t>chặn</w:t>
-      </w:r>
-      <w:proofErr w:type="spellEnd"/>
-      <w:r>
-        <w:t xml:space="preserve"> ICMP </w:t>
-      </w:r>
-      <w:proofErr w:type="spellStart"/>
-      <w:r>
-        <w:t>cần</w:t>
-      </w:r>
-      <w:proofErr w:type="spellEnd"/>
-      <w:r>
-        <w:t xml:space="preserve"> </w:t>
-      </w:r>
-      <w:proofErr w:type="spellStart"/>
-      <w:r>
-        <w:t>được</w:t>
-      </w:r>
-      <w:proofErr w:type="spellEnd"/>
-      <w:r>
-        <w:t xml:space="preserve"> </w:t>
-      </w:r>
-      <w:proofErr w:type="spellStart"/>
-      <w:r>
-        <w:t>đặt</w:t>
-      </w:r>
-      <w:proofErr w:type="spellEnd"/>
-      <w:r>
-        <w:t xml:space="preserve"> </w:t>
-      </w:r>
-      <w:proofErr w:type="spellStart"/>
-      <w:r>
-        <w:t>đúng</w:t>
-      </w:r>
-      <w:proofErr w:type="spellEnd"/>
-      <w:r>
-        <w:t xml:space="preserve"> </w:t>
-      </w:r>
-      <w:proofErr w:type="spellStart"/>
-      <w:r>
-        <w:t>thứ</w:t>
-      </w:r>
-      <w:proofErr w:type="spellEnd"/>
-      <w:r>
-        <w:t xml:space="preserve"> </w:t>
-      </w:r>
-      <w:proofErr w:type="spellStart"/>
-      <w:r>
-        <w:t>tự</w:t>
-      </w:r>
-      <w:proofErr w:type="spellEnd"/>
-      <w:r>
-        <w:t xml:space="preserve"> </w:t>
-      </w:r>
-      <w:proofErr w:type="spellStart"/>
-      <w:r>
-        <w:t>để</w:t>
-      </w:r>
-      <w:proofErr w:type="spellEnd"/>
-      <w:r>
-        <w:t xml:space="preserve"> </w:t>
-      </w:r>
-      <w:proofErr w:type="spellStart"/>
-      <w:r>
-        <w:t>không</w:t>
-      </w:r>
-      <w:proofErr w:type="spellEnd"/>
-      <w:r>
-        <w:t xml:space="preserve"> </w:t>
-      </w:r>
-      <w:proofErr w:type="spellStart"/>
-      <w:r>
-        <w:t>bị</w:t>
-      </w:r>
-      <w:proofErr w:type="spellEnd"/>
-      <w:r>
-        <w:t xml:space="preserve"> rule Pass </w:t>
-      </w:r>
-      <w:proofErr w:type="spellStart"/>
-      <w:r>
-        <w:t>tổng</w:t>
-      </w:r>
-      <w:proofErr w:type="spellEnd"/>
-      <w:r>
-        <w:t xml:space="preserve"> </w:t>
-      </w:r>
-      <w:proofErr w:type="spellStart"/>
-      <w:r>
-        <w:t>quát</w:t>
-      </w:r>
-      <w:proofErr w:type="spellEnd"/>
-      <w:r>
-        <w:t xml:space="preserve"> </w:t>
-      </w:r>
-      <w:proofErr w:type="spellStart"/>
-      <w:r>
-        <w:t>phía</w:t>
-      </w:r>
-      <w:proofErr w:type="spellEnd"/>
-      <w:r>
-        <w:t xml:space="preserve"> </w:t>
-      </w:r>
-      <w:proofErr w:type="spellStart"/>
-      <w:r>
-        <w:t>trên</w:t>
-      </w:r>
-      <w:proofErr w:type="spellEnd"/>
-      <w:r>
-        <w:t xml:space="preserve"> </w:t>
-      </w:r>
-      <w:proofErr w:type="spellStart"/>
-      <w:r>
-        <w:t>ghi</w:t>
-      </w:r>
-      <w:proofErr w:type="spellEnd"/>
-      <w:r>
-        <w:t xml:space="preserve"> </w:t>
-      </w:r>
-      <w:proofErr w:type="spellStart"/>
-      <w:r>
-        <w:t>đè</w:t>
-      </w:r>
-      <w:proofErr w:type="spellEnd"/>
-      <w:r>
-        <w:t xml:space="preserve"> </w:t>
-      </w:r>
-      <w:proofErr w:type="spellStart"/>
-      <w:r>
-        <w:t>về</w:t>
-      </w:r>
-      <w:proofErr w:type="spellEnd"/>
-      <w:r>
-        <w:t xml:space="preserve"> </w:t>
-      </w:r>
-      <w:proofErr w:type="spellStart"/>
-      <w:r>
-        <w:t>mặt</w:t>
-      </w:r>
-      <w:proofErr w:type="spellEnd"/>
-      <w:r>
-        <w:t xml:space="preserve"> </w:t>
-      </w:r>
-      <w:proofErr w:type="spellStart"/>
-      <w:r>
-        <w:t>xử</w:t>
-      </w:r>
-      <w:proofErr w:type="spellEnd"/>
-      <w:r>
-        <w:t xml:space="preserve"> </w:t>
-      </w:r>
-      <w:proofErr w:type="spellStart"/>
-      <w:r>
-        <w:t>lý</w:t>
-      </w:r>
-      <w:proofErr w:type="spellEnd"/>
-      <w:r>
-        <w:t>.</w:t>
+        <w:t>. Rule chặn ICMP cần được đặt đúng thứ tự để không bị rule Pass tổng quát phía trên ghi đè về mặt xử lý.</w:t>
       </w:r>
     </w:p>
     <w:p>
@@ -5429,1265 +3178,47 @@
           <w:b/>
           <w:bCs/>
         </w:rPr>
-        <w:t xml:space="preserve">5. Logging </w:t>
-      </w:r>
-      <w:proofErr w:type="spellStart"/>
+        <w:t>5. Logging của firewall giúp ích gì trong xử lý sự cố?</w:t>
+      </w:r>
+      <w:r>
+        <w:br/>
+      </w:r>
       <w:r>
         <w:rPr>
           <w:b/>
           <w:bCs/>
         </w:rPr>
-        <w:t>của</w:t>
-      </w:r>
-      <w:proofErr w:type="spellEnd"/>
+        <w:t>Trả lời:</w:t>
+      </w:r>
+      <w:r>
+        <w:t xml:space="preserve"> Logging giúp ghi lại các kết nối bị chặn hoặc được cho phép, bao gồm IP nguồn, IP đích, cổng và giao thức. Nhờ đó quản trị viên có thể xác định nguyên nhân lỗi kết nối, kiểm tra rule và phát hiện các hoạt động mạng bất thường.</w:t>
+      </w:r>
+    </w:p>
+    <w:p>
       <w:r>
         <w:rPr>
           <w:b/>
           <w:bCs/>
         </w:rPr>
-        <w:t xml:space="preserve"> firewall </w:t>
-      </w:r>
-      <w:proofErr w:type="spellStart"/>
+        <w:t>6. Nêu ít nhất ba biện pháp hardening cho pfSense trong mô hình này.</w:t>
+      </w:r>
+      <w:r>
+        <w:br/>
+      </w:r>
       <w:r>
         <w:rPr>
           <w:b/>
           <w:bCs/>
         </w:rPr>
-        <w:t>giúp</w:t>
-      </w:r>
-      <w:proofErr w:type="spellEnd"/>
-      <w:r>
-        <w:rPr>
-          <w:b/>
-          <w:bCs/>
-        </w:rPr>
-        <w:t xml:space="preserve"> </w:t>
-      </w:r>
-      <w:proofErr w:type="spellStart"/>
-      <w:r>
-        <w:rPr>
-          <w:b/>
-          <w:bCs/>
-        </w:rPr>
-        <w:t>ích</w:t>
-      </w:r>
-      <w:proofErr w:type="spellEnd"/>
-      <w:r>
-        <w:rPr>
-          <w:b/>
-          <w:bCs/>
-        </w:rPr>
-        <w:t xml:space="preserve"> </w:t>
-      </w:r>
-      <w:proofErr w:type="spellStart"/>
-      <w:r>
-        <w:rPr>
-          <w:b/>
-          <w:bCs/>
-        </w:rPr>
-        <w:t>gì</w:t>
-      </w:r>
-      <w:proofErr w:type="spellEnd"/>
-      <w:r>
-        <w:rPr>
-          <w:b/>
-          <w:bCs/>
-        </w:rPr>
-        <w:t xml:space="preserve"> </w:t>
-      </w:r>
-      <w:proofErr w:type="spellStart"/>
-      <w:r>
-        <w:rPr>
-          <w:b/>
-          <w:bCs/>
-        </w:rPr>
-        <w:t>trong</w:t>
-      </w:r>
-      <w:proofErr w:type="spellEnd"/>
-      <w:r>
-        <w:rPr>
-          <w:b/>
-          <w:bCs/>
-        </w:rPr>
-        <w:t xml:space="preserve"> </w:t>
-      </w:r>
-      <w:proofErr w:type="spellStart"/>
-      <w:r>
-        <w:rPr>
-          <w:b/>
-          <w:bCs/>
-        </w:rPr>
-        <w:t>xử</w:t>
-      </w:r>
-      <w:proofErr w:type="spellEnd"/>
-      <w:r>
-        <w:rPr>
-          <w:b/>
-          <w:bCs/>
-        </w:rPr>
-        <w:t xml:space="preserve"> </w:t>
-      </w:r>
-      <w:proofErr w:type="spellStart"/>
-      <w:r>
-        <w:rPr>
-          <w:b/>
-          <w:bCs/>
-        </w:rPr>
-        <w:t>lý</w:t>
-      </w:r>
-      <w:proofErr w:type="spellEnd"/>
-      <w:r>
-        <w:rPr>
-          <w:b/>
-          <w:bCs/>
-        </w:rPr>
-        <w:t xml:space="preserve"> </w:t>
-      </w:r>
-      <w:proofErr w:type="spellStart"/>
-      <w:r>
-        <w:rPr>
-          <w:b/>
-          <w:bCs/>
-        </w:rPr>
-        <w:t>sự</w:t>
-      </w:r>
-      <w:proofErr w:type="spellEnd"/>
-      <w:r>
-        <w:rPr>
-          <w:b/>
-          <w:bCs/>
-        </w:rPr>
-        <w:t xml:space="preserve"> </w:t>
-      </w:r>
-      <w:proofErr w:type="spellStart"/>
-      <w:r>
-        <w:rPr>
-          <w:b/>
-          <w:bCs/>
-        </w:rPr>
-        <w:t>cố</w:t>
-      </w:r>
-      <w:proofErr w:type="spellEnd"/>
-      <w:r>
-        <w:rPr>
-          <w:b/>
-          <w:bCs/>
-        </w:rPr>
-        <w:t>?</w:t>
-      </w:r>
-      <w:r>
-        <w:br/>
-      </w:r>
-      <w:proofErr w:type="spellStart"/>
-      <w:r>
-        <w:rPr>
-          <w:b/>
-          <w:bCs/>
-        </w:rPr>
-        <w:t>Trả</w:t>
-      </w:r>
-      <w:proofErr w:type="spellEnd"/>
-      <w:r>
-        <w:rPr>
-          <w:b/>
-          <w:bCs/>
-        </w:rPr>
-        <w:t xml:space="preserve"> </w:t>
-      </w:r>
-      <w:proofErr w:type="spellStart"/>
-      <w:r>
-        <w:rPr>
-          <w:b/>
-          <w:bCs/>
-        </w:rPr>
-        <w:t>lời</w:t>
-      </w:r>
-      <w:proofErr w:type="spellEnd"/>
-      <w:r>
-        <w:rPr>
-          <w:b/>
-          <w:bCs/>
-        </w:rPr>
-        <w:t>:</w:t>
-      </w:r>
-      <w:r>
-        <w:t xml:space="preserve"> Logging </w:t>
-      </w:r>
-      <w:proofErr w:type="spellStart"/>
-      <w:r>
-        <w:t>giúp</w:t>
-      </w:r>
-      <w:proofErr w:type="spellEnd"/>
-      <w:r>
-        <w:t xml:space="preserve"> </w:t>
-      </w:r>
-      <w:proofErr w:type="spellStart"/>
-      <w:r>
-        <w:t>ghi</w:t>
-      </w:r>
-      <w:proofErr w:type="spellEnd"/>
-      <w:r>
-        <w:t xml:space="preserve"> </w:t>
-      </w:r>
-      <w:proofErr w:type="spellStart"/>
-      <w:r>
-        <w:t>lại</w:t>
-      </w:r>
-      <w:proofErr w:type="spellEnd"/>
-      <w:r>
-        <w:t xml:space="preserve"> </w:t>
-      </w:r>
-      <w:proofErr w:type="spellStart"/>
-      <w:r>
-        <w:t>các</w:t>
-      </w:r>
-      <w:proofErr w:type="spellEnd"/>
-      <w:r>
-        <w:t xml:space="preserve"> </w:t>
-      </w:r>
-      <w:proofErr w:type="spellStart"/>
-      <w:r>
-        <w:t>kết</w:t>
-      </w:r>
-      <w:proofErr w:type="spellEnd"/>
-      <w:r>
-        <w:t xml:space="preserve"> </w:t>
-      </w:r>
-      <w:proofErr w:type="spellStart"/>
-      <w:r>
-        <w:t>nối</w:t>
-      </w:r>
-      <w:proofErr w:type="spellEnd"/>
-      <w:r>
-        <w:t xml:space="preserve"> </w:t>
-      </w:r>
-      <w:proofErr w:type="spellStart"/>
-      <w:r>
-        <w:t>bị</w:t>
-      </w:r>
-      <w:proofErr w:type="spellEnd"/>
-      <w:r>
-        <w:t xml:space="preserve"> </w:t>
-      </w:r>
-      <w:proofErr w:type="spellStart"/>
-      <w:r>
-        <w:t>chặn</w:t>
-      </w:r>
-      <w:proofErr w:type="spellEnd"/>
-      <w:r>
-        <w:t xml:space="preserve"> </w:t>
-      </w:r>
-      <w:proofErr w:type="spellStart"/>
-      <w:r>
-        <w:t>hoặc</w:t>
-      </w:r>
-      <w:proofErr w:type="spellEnd"/>
-      <w:r>
-        <w:t xml:space="preserve"> </w:t>
-      </w:r>
-      <w:proofErr w:type="spellStart"/>
-      <w:r>
-        <w:t>được</w:t>
-      </w:r>
-      <w:proofErr w:type="spellEnd"/>
-      <w:r>
-        <w:t xml:space="preserve"> </w:t>
-      </w:r>
-      <w:proofErr w:type="spellStart"/>
-      <w:r>
-        <w:t>cho</w:t>
-      </w:r>
-      <w:proofErr w:type="spellEnd"/>
-      <w:r>
-        <w:t xml:space="preserve"> </w:t>
-      </w:r>
-      <w:proofErr w:type="spellStart"/>
-      <w:r>
-        <w:t>phép</w:t>
-      </w:r>
-      <w:proofErr w:type="spellEnd"/>
-      <w:r>
-        <w:t xml:space="preserve">, bao </w:t>
-      </w:r>
-      <w:proofErr w:type="spellStart"/>
-      <w:r>
-        <w:t>gồm</w:t>
-      </w:r>
-      <w:proofErr w:type="spellEnd"/>
-      <w:r>
-        <w:t xml:space="preserve"> IP </w:t>
-      </w:r>
-      <w:proofErr w:type="spellStart"/>
-      <w:r>
-        <w:t>nguồn</w:t>
-      </w:r>
-      <w:proofErr w:type="spellEnd"/>
-      <w:r>
-        <w:t xml:space="preserve">, IP </w:t>
-      </w:r>
-      <w:proofErr w:type="spellStart"/>
-      <w:r>
-        <w:t>đích</w:t>
-      </w:r>
-      <w:proofErr w:type="spellEnd"/>
-      <w:r>
-        <w:t xml:space="preserve">, </w:t>
-      </w:r>
-      <w:proofErr w:type="spellStart"/>
-      <w:r>
-        <w:t>cổng</w:t>
-      </w:r>
-      <w:proofErr w:type="spellEnd"/>
-      <w:r>
-        <w:t xml:space="preserve"> </w:t>
-      </w:r>
-      <w:proofErr w:type="spellStart"/>
-      <w:r>
-        <w:t>và</w:t>
-      </w:r>
-      <w:proofErr w:type="spellEnd"/>
-      <w:r>
-        <w:t xml:space="preserve"> </w:t>
-      </w:r>
-      <w:proofErr w:type="spellStart"/>
-      <w:r>
-        <w:t>giao</w:t>
-      </w:r>
-      <w:proofErr w:type="spellEnd"/>
-      <w:r>
-        <w:t xml:space="preserve"> </w:t>
-      </w:r>
-      <w:proofErr w:type="spellStart"/>
-      <w:r>
-        <w:t>thức</w:t>
-      </w:r>
-      <w:proofErr w:type="spellEnd"/>
-      <w:r>
-        <w:t xml:space="preserve">. </w:t>
-      </w:r>
-      <w:proofErr w:type="spellStart"/>
-      <w:r>
-        <w:t>Nhờ</w:t>
-      </w:r>
-      <w:proofErr w:type="spellEnd"/>
-      <w:r>
-        <w:t xml:space="preserve"> </w:t>
-      </w:r>
-      <w:proofErr w:type="spellStart"/>
-      <w:r>
-        <w:t>đó</w:t>
-      </w:r>
-      <w:proofErr w:type="spellEnd"/>
-      <w:r>
-        <w:t xml:space="preserve"> </w:t>
-      </w:r>
-      <w:proofErr w:type="spellStart"/>
-      <w:r>
-        <w:t>quản</w:t>
-      </w:r>
-      <w:proofErr w:type="spellEnd"/>
-      <w:r>
-        <w:t xml:space="preserve"> </w:t>
-      </w:r>
-      <w:proofErr w:type="spellStart"/>
-      <w:r>
-        <w:t>trị</w:t>
-      </w:r>
-      <w:proofErr w:type="spellEnd"/>
-      <w:r>
-        <w:t xml:space="preserve"> </w:t>
-      </w:r>
-      <w:proofErr w:type="spellStart"/>
-      <w:r>
-        <w:t>viên</w:t>
-      </w:r>
-      <w:proofErr w:type="spellEnd"/>
-      <w:r>
-        <w:t xml:space="preserve"> </w:t>
-      </w:r>
-      <w:proofErr w:type="spellStart"/>
-      <w:r>
-        <w:t>có</w:t>
-      </w:r>
-      <w:proofErr w:type="spellEnd"/>
-      <w:r>
-        <w:t xml:space="preserve"> </w:t>
-      </w:r>
-      <w:proofErr w:type="spellStart"/>
-      <w:r>
-        <w:t>thể</w:t>
-      </w:r>
-      <w:proofErr w:type="spellEnd"/>
-      <w:r>
-        <w:t xml:space="preserve"> </w:t>
-      </w:r>
-      <w:proofErr w:type="spellStart"/>
-      <w:r>
-        <w:t>xác</w:t>
-      </w:r>
-      <w:proofErr w:type="spellEnd"/>
-      <w:r>
-        <w:t xml:space="preserve"> </w:t>
-      </w:r>
-      <w:proofErr w:type="spellStart"/>
-      <w:r>
-        <w:t>định</w:t>
-      </w:r>
-      <w:proofErr w:type="spellEnd"/>
-      <w:r>
-        <w:t xml:space="preserve"> </w:t>
-      </w:r>
-      <w:proofErr w:type="spellStart"/>
-      <w:r>
-        <w:t>nguyên</w:t>
-      </w:r>
-      <w:proofErr w:type="spellEnd"/>
-      <w:r>
-        <w:t xml:space="preserve"> </w:t>
-      </w:r>
-      <w:proofErr w:type="spellStart"/>
-      <w:r>
-        <w:t>nhân</w:t>
-      </w:r>
-      <w:proofErr w:type="spellEnd"/>
-      <w:r>
-        <w:t xml:space="preserve"> </w:t>
-      </w:r>
-      <w:proofErr w:type="spellStart"/>
-      <w:r>
-        <w:t>lỗi</w:t>
-      </w:r>
-      <w:proofErr w:type="spellEnd"/>
-      <w:r>
-        <w:t xml:space="preserve"> </w:t>
-      </w:r>
-      <w:proofErr w:type="spellStart"/>
-      <w:r>
-        <w:t>kết</w:t>
-      </w:r>
-      <w:proofErr w:type="spellEnd"/>
-      <w:r>
-        <w:t xml:space="preserve"> </w:t>
-      </w:r>
-      <w:proofErr w:type="spellStart"/>
-      <w:r>
-        <w:t>nối</w:t>
-      </w:r>
-      <w:proofErr w:type="spellEnd"/>
-      <w:r>
-        <w:t xml:space="preserve">, </w:t>
-      </w:r>
-      <w:proofErr w:type="spellStart"/>
-      <w:r>
-        <w:t>kiểm</w:t>
-      </w:r>
-      <w:proofErr w:type="spellEnd"/>
-      <w:r>
-        <w:t xml:space="preserve"> </w:t>
-      </w:r>
-      <w:proofErr w:type="spellStart"/>
-      <w:r>
-        <w:t>tra</w:t>
-      </w:r>
-      <w:proofErr w:type="spellEnd"/>
-      <w:r>
-        <w:t xml:space="preserve"> rule </w:t>
-      </w:r>
-      <w:proofErr w:type="spellStart"/>
-      <w:r>
-        <w:t>và</w:t>
-      </w:r>
-      <w:proofErr w:type="spellEnd"/>
-      <w:r>
-        <w:t xml:space="preserve"> </w:t>
-      </w:r>
-      <w:proofErr w:type="spellStart"/>
-      <w:r>
-        <w:t>phát</w:t>
-      </w:r>
-      <w:proofErr w:type="spellEnd"/>
-      <w:r>
-        <w:t xml:space="preserve"> </w:t>
-      </w:r>
-      <w:proofErr w:type="spellStart"/>
-      <w:r>
-        <w:t>hiện</w:t>
-      </w:r>
-      <w:proofErr w:type="spellEnd"/>
-      <w:r>
-        <w:t xml:space="preserve"> </w:t>
-      </w:r>
-      <w:proofErr w:type="spellStart"/>
-      <w:r>
-        <w:t>các</w:t>
-      </w:r>
-      <w:proofErr w:type="spellEnd"/>
-      <w:r>
-        <w:t xml:space="preserve"> </w:t>
-      </w:r>
-      <w:proofErr w:type="spellStart"/>
-      <w:r>
-        <w:t>hoạt</w:t>
-      </w:r>
-      <w:proofErr w:type="spellEnd"/>
-      <w:r>
-        <w:t xml:space="preserve"> </w:t>
-      </w:r>
-      <w:proofErr w:type="spellStart"/>
-      <w:r>
-        <w:t>động</w:t>
-      </w:r>
-      <w:proofErr w:type="spellEnd"/>
-      <w:r>
-        <w:t xml:space="preserve"> </w:t>
-      </w:r>
-      <w:proofErr w:type="spellStart"/>
-      <w:r>
-        <w:t>mạng</w:t>
-      </w:r>
-      <w:proofErr w:type="spellEnd"/>
-      <w:r>
-        <w:t xml:space="preserve"> </w:t>
-      </w:r>
-      <w:proofErr w:type="spellStart"/>
-      <w:r>
-        <w:t>bất</w:t>
-      </w:r>
-      <w:proofErr w:type="spellEnd"/>
-      <w:r>
-        <w:t xml:space="preserve"> </w:t>
-      </w:r>
-      <w:proofErr w:type="spellStart"/>
-      <w:r>
-        <w:t>thường</w:t>
-      </w:r>
-      <w:proofErr w:type="spellEnd"/>
-      <w:r>
-        <w:t>.</w:t>
-      </w:r>
-    </w:p>
-    <w:p>
-      <w:r>
-        <w:rPr>
-          <w:b/>
-          <w:bCs/>
-        </w:rPr>
-        <w:t xml:space="preserve">6. </w:t>
-      </w:r>
-      <w:proofErr w:type="spellStart"/>
-      <w:r>
-        <w:rPr>
-          <w:b/>
-          <w:bCs/>
-        </w:rPr>
-        <w:t>Nêu</w:t>
-      </w:r>
-      <w:proofErr w:type="spellEnd"/>
-      <w:r>
-        <w:rPr>
-          <w:b/>
-          <w:bCs/>
-        </w:rPr>
-        <w:t xml:space="preserve"> </w:t>
-      </w:r>
-      <w:proofErr w:type="spellStart"/>
-      <w:r>
-        <w:rPr>
-          <w:b/>
-          <w:bCs/>
-        </w:rPr>
-        <w:t>ít</w:t>
-      </w:r>
-      <w:proofErr w:type="spellEnd"/>
-      <w:r>
-        <w:rPr>
-          <w:b/>
-          <w:bCs/>
-        </w:rPr>
-        <w:t xml:space="preserve"> </w:t>
-      </w:r>
-      <w:proofErr w:type="spellStart"/>
-      <w:r>
-        <w:rPr>
-          <w:b/>
-          <w:bCs/>
-        </w:rPr>
-        <w:t>nhất</w:t>
-      </w:r>
-      <w:proofErr w:type="spellEnd"/>
-      <w:r>
-        <w:rPr>
-          <w:b/>
-          <w:bCs/>
-        </w:rPr>
-        <w:t xml:space="preserve"> </w:t>
-      </w:r>
-      <w:proofErr w:type="spellStart"/>
-      <w:r>
-        <w:rPr>
-          <w:b/>
-          <w:bCs/>
-        </w:rPr>
-        <w:t>ba</w:t>
-      </w:r>
-      <w:proofErr w:type="spellEnd"/>
-      <w:r>
-        <w:rPr>
-          <w:b/>
-          <w:bCs/>
-        </w:rPr>
-        <w:t xml:space="preserve"> </w:t>
-      </w:r>
-      <w:proofErr w:type="spellStart"/>
-      <w:r>
-        <w:rPr>
-          <w:b/>
-          <w:bCs/>
-        </w:rPr>
-        <w:t>biện</w:t>
-      </w:r>
-      <w:proofErr w:type="spellEnd"/>
-      <w:r>
-        <w:rPr>
-          <w:b/>
-          <w:bCs/>
-        </w:rPr>
-        <w:t xml:space="preserve"> </w:t>
-      </w:r>
-      <w:proofErr w:type="spellStart"/>
-      <w:r>
-        <w:rPr>
-          <w:b/>
-          <w:bCs/>
-        </w:rPr>
-        <w:t>pháp</w:t>
-      </w:r>
-      <w:proofErr w:type="spellEnd"/>
-      <w:r>
-        <w:rPr>
-          <w:b/>
-          <w:bCs/>
-        </w:rPr>
-        <w:t xml:space="preserve"> hardening </w:t>
-      </w:r>
-      <w:proofErr w:type="spellStart"/>
-      <w:r>
-        <w:rPr>
-          <w:b/>
-          <w:bCs/>
-        </w:rPr>
-        <w:t>cho</w:t>
-      </w:r>
-      <w:proofErr w:type="spellEnd"/>
-      <w:r>
-        <w:rPr>
-          <w:b/>
-          <w:bCs/>
-        </w:rPr>
-        <w:t xml:space="preserve"> </w:t>
-      </w:r>
-      <w:proofErr w:type="spellStart"/>
-      <w:r>
-        <w:rPr>
-          <w:b/>
-          <w:bCs/>
-        </w:rPr>
-        <w:t>pfSense</w:t>
-      </w:r>
-      <w:proofErr w:type="spellEnd"/>
-      <w:r>
-        <w:rPr>
-          <w:b/>
-          <w:bCs/>
-        </w:rPr>
-        <w:t xml:space="preserve"> </w:t>
-      </w:r>
-      <w:proofErr w:type="spellStart"/>
-      <w:r>
-        <w:rPr>
-          <w:b/>
-          <w:bCs/>
-        </w:rPr>
-        <w:t>trong</w:t>
-      </w:r>
-      <w:proofErr w:type="spellEnd"/>
-      <w:r>
-        <w:rPr>
-          <w:b/>
-          <w:bCs/>
-        </w:rPr>
-        <w:t xml:space="preserve"> </w:t>
-      </w:r>
-      <w:proofErr w:type="spellStart"/>
-      <w:r>
-        <w:rPr>
-          <w:b/>
-          <w:bCs/>
-        </w:rPr>
-        <w:t>mô</w:t>
-      </w:r>
-      <w:proofErr w:type="spellEnd"/>
-      <w:r>
-        <w:rPr>
-          <w:b/>
-          <w:bCs/>
-        </w:rPr>
-        <w:t xml:space="preserve"> </w:t>
-      </w:r>
-      <w:proofErr w:type="spellStart"/>
-      <w:r>
-        <w:rPr>
-          <w:b/>
-          <w:bCs/>
-        </w:rPr>
-        <w:t>hình</w:t>
-      </w:r>
-      <w:proofErr w:type="spellEnd"/>
-      <w:r>
-        <w:rPr>
-          <w:b/>
-          <w:bCs/>
-        </w:rPr>
-        <w:t xml:space="preserve"> </w:t>
-      </w:r>
-      <w:proofErr w:type="spellStart"/>
-      <w:r>
-        <w:rPr>
-          <w:b/>
-          <w:bCs/>
-        </w:rPr>
-        <w:t>này</w:t>
-      </w:r>
-      <w:proofErr w:type="spellEnd"/>
-      <w:r>
-        <w:rPr>
-          <w:b/>
-          <w:bCs/>
-        </w:rPr>
-        <w:t>.</w:t>
-      </w:r>
-      <w:r>
-        <w:br/>
-      </w:r>
-      <w:proofErr w:type="spellStart"/>
-      <w:r>
-        <w:rPr>
-          <w:b/>
-          <w:bCs/>
-        </w:rPr>
-        <w:t>Trả</w:t>
-      </w:r>
-      <w:proofErr w:type="spellEnd"/>
-      <w:r>
-        <w:rPr>
-          <w:b/>
-          <w:bCs/>
-        </w:rPr>
-        <w:t xml:space="preserve"> </w:t>
-      </w:r>
-      <w:proofErr w:type="spellStart"/>
-      <w:r>
-        <w:rPr>
-          <w:b/>
-          <w:bCs/>
-        </w:rPr>
-        <w:t>lời</w:t>
-      </w:r>
-      <w:proofErr w:type="spellEnd"/>
-      <w:r>
-        <w:rPr>
-          <w:b/>
-          <w:bCs/>
-        </w:rPr>
-        <w:t>:</w:t>
-      </w:r>
-      <w:r>
-        <w:t xml:space="preserve"> </w:t>
-      </w:r>
-      <w:proofErr w:type="spellStart"/>
-      <w:r>
-        <w:t>Có</w:t>
-      </w:r>
-      <w:proofErr w:type="spellEnd"/>
-      <w:r>
-        <w:t xml:space="preserve"> </w:t>
-      </w:r>
-      <w:proofErr w:type="spellStart"/>
-      <w:r>
-        <w:t>thể</w:t>
-      </w:r>
-      <w:proofErr w:type="spellEnd"/>
-      <w:r>
-        <w:t xml:space="preserve"> </w:t>
-      </w:r>
-      <w:proofErr w:type="spellStart"/>
-      <w:r>
-        <w:t>đổi</w:t>
-      </w:r>
-      <w:proofErr w:type="spellEnd"/>
-      <w:r>
-        <w:t xml:space="preserve"> </w:t>
-      </w:r>
-      <w:proofErr w:type="spellStart"/>
-      <w:r>
-        <w:t>mật</w:t>
-      </w:r>
-      <w:proofErr w:type="spellEnd"/>
-      <w:r>
-        <w:t xml:space="preserve"> </w:t>
-      </w:r>
-      <w:proofErr w:type="spellStart"/>
-      <w:r>
-        <w:t>khẩu</w:t>
-      </w:r>
-      <w:proofErr w:type="spellEnd"/>
-      <w:r>
-        <w:t xml:space="preserve"> </w:t>
-      </w:r>
-      <w:proofErr w:type="spellStart"/>
-      <w:r>
-        <w:t>mặc</w:t>
-      </w:r>
-      <w:proofErr w:type="spellEnd"/>
-      <w:r>
-        <w:t xml:space="preserve"> </w:t>
-      </w:r>
-      <w:proofErr w:type="spellStart"/>
-      <w:r>
-        <w:t>định</w:t>
-      </w:r>
-      <w:proofErr w:type="spellEnd"/>
-      <w:r>
-        <w:t xml:space="preserve"> </w:t>
-      </w:r>
-      <w:proofErr w:type="spellStart"/>
-      <w:r>
-        <w:t>của</w:t>
-      </w:r>
-      <w:proofErr w:type="spellEnd"/>
-      <w:r>
-        <w:t xml:space="preserve"> </w:t>
-      </w:r>
-      <w:proofErr w:type="spellStart"/>
-      <w:r>
-        <w:t>tài</w:t>
-      </w:r>
-      <w:proofErr w:type="spellEnd"/>
-      <w:r>
-        <w:t xml:space="preserve"> </w:t>
-      </w:r>
-      <w:proofErr w:type="spellStart"/>
-      <w:r>
-        <w:t>khoản</w:t>
-      </w:r>
-      <w:proofErr w:type="spellEnd"/>
-      <w:r>
-        <w:t xml:space="preserve"> admin </w:t>
-      </w:r>
-      <w:proofErr w:type="spellStart"/>
-      <w:r>
-        <w:t>thành</w:t>
-      </w:r>
-      <w:proofErr w:type="spellEnd"/>
-      <w:r>
-        <w:t xml:space="preserve"> </w:t>
-      </w:r>
-      <w:proofErr w:type="spellStart"/>
-      <w:r>
-        <w:t>mật</w:t>
-      </w:r>
-      <w:proofErr w:type="spellEnd"/>
-      <w:r>
-        <w:t xml:space="preserve"> </w:t>
-      </w:r>
-      <w:proofErr w:type="spellStart"/>
-      <w:r>
-        <w:t>khẩu</w:t>
-      </w:r>
-      <w:proofErr w:type="spellEnd"/>
-      <w:r>
-        <w:t xml:space="preserve"> </w:t>
-      </w:r>
-      <w:proofErr w:type="spellStart"/>
-      <w:r>
-        <w:t>mạnh</w:t>
-      </w:r>
-      <w:proofErr w:type="spellEnd"/>
-      <w:r>
-        <w:t xml:space="preserve">; </w:t>
-      </w:r>
-      <w:proofErr w:type="spellStart"/>
-      <w:r>
-        <w:t>chỉ</w:t>
-      </w:r>
-      <w:proofErr w:type="spellEnd"/>
-      <w:r>
-        <w:t xml:space="preserve"> </w:t>
-      </w:r>
-      <w:proofErr w:type="spellStart"/>
-      <w:r>
-        <w:t>cho</w:t>
-      </w:r>
-      <w:proofErr w:type="spellEnd"/>
-      <w:r>
-        <w:t xml:space="preserve"> </w:t>
-      </w:r>
-      <w:proofErr w:type="spellStart"/>
-      <w:r>
-        <w:t>phép</w:t>
-      </w:r>
-      <w:proofErr w:type="spellEnd"/>
-      <w:r>
-        <w:t xml:space="preserve"> </w:t>
-      </w:r>
-      <w:proofErr w:type="spellStart"/>
-      <w:r>
-        <w:t>quản</w:t>
-      </w:r>
-      <w:proofErr w:type="spellEnd"/>
-      <w:r>
-        <w:t xml:space="preserve"> </w:t>
-      </w:r>
-      <w:proofErr w:type="spellStart"/>
-      <w:r>
-        <w:t>trị</w:t>
-      </w:r>
-      <w:proofErr w:type="spellEnd"/>
-      <w:r>
-        <w:t xml:space="preserve"> </w:t>
-      </w:r>
-      <w:proofErr w:type="spellStart"/>
-      <w:r>
-        <w:t>pfSense</w:t>
-      </w:r>
-      <w:proofErr w:type="spellEnd"/>
-      <w:r>
-        <w:t xml:space="preserve"> </w:t>
-      </w:r>
-      <w:proofErr w:type="spellStart"/>
-      <w:r>
-        <w:t>từ</w:t>
-      </w:r>
-      <w:proofErr w:type="spellEnd"/>
-      <w:r>
-        <w:t xml:space="preserve"> </w:t>
-      </w:r>
-      <w:proofErr w:type="spellStart"/>
-      <w:r>
-        <w:t>mạng</w:t>
-      </w:r>
-      <w:proofErr w:type="spellEnd"/>
-      <w:r>
-        <w:t xml:space="preserve"> LAN tin </w:t>
-      </w:r>
-      <w:proofErr w:type="spellStart"/>
-      <w:r>
-        <w:t>cậy</w:t>
-      </w:r>
-      <w:proofErr w:type="spellEnd"/>
-      <w:r>
-        <w:t xml:space="preserve">; </w:t>
-      </w:r>
-      <w:proofErr w:type="spellStart"/>
-      <w:r>
-        <w:t>cập</w:t>
-      </w:r>
-      <w:proofErr w:type="spellEnd"/>
-      <w:r>
-        <w:t xml:space="preserve"> </w:t>
-      </w:r>
-      <w:proofErr w:type="spellStart"/>
-      <w:r>
-        <w:t>nhật</w:t>
-      </w:r>
-      <w:proofErr w:type="spellEnd"/>
-      <w:r>
-        <w:t xml:space="preserve"> </w:t>
-      </w:r>
-      <w:proofErr w:type="spellStart"/>
-      <w:r>
-        <w:t>pfSense</w:t>
-      </w:r>
-      <w:proofErr w:type="spellEnd"/>
-      <w:r>
-        <w:t xml:space="preserve"> </w:t>
-      </w:r>
-      <w:proofErr w:type="spellStart"/>
-      <w:r>
-        <w:t>thường</w:t>
-      </w:r>
-      <w:proofErr w:type="spellEnd"/>
-      <w:r>
-        <w:t xml:space="preserve"> </w:t>
-      </w:r>
-      <w:proofErr w:type="spellStart"/>
-      <w:r>
-        <w:t>xuyên</w:t>
-      </w:r>
-      <w:proofErr w:type="spellEnd"/>
-      <w:r>
-        <w:t xml:space="preserve">; </w:t>
-      </w:r>
-      <w:proofErr w:type="spellStart"/>
-      <w:r>
-        <w:t>chỉ</w:t>
-      </w:r>
-      <w:proofErr w:type="spellEnd"/>
-      <w:r>
-        <w:t xml:space="preserve"> </w:t>
-      </w:r>
-      <w:proofErr w:type="spellStart"/>
-      <w:r>
-        <w:t>mở</w:t>
-      </w:r>
-      <w:proofErr w:type="spellEnd"/>
-      <w:r>
-        <w:t xml:space="preserve"> </w:t>
-      </w:r>
-      <w:proofErr w:type="spellStart"/>
-      <w:r>
-        <w:t>các</w:t>
-      </w:r>
-      <w:proofErr w:type="spellEnd"/>
-      <w:r>
-        <w:t xml:space="preserve"> port </w:t>
-      </w:r>
-      <w:proofErr w:type="spellStart"/>
-      <w:r>
-        <w:t>và</w:t>
-      </w:r>
-      <w:proofErr w:type="spellEnd"/>
-      <w:r>
-        <w:t xml:space="preserve"> </w:t>
-      </w:r>
-      <w:proofErr w:type="spellStart"/>
-      <w:r>
-        <w:t>dịch</w:t>
-      </w:r>
-      <w:proofErr w:type="spellEnd"/>
-      <w:r>
-        <w:t xml:space="preserve"> </w:t>
-      </w:r>
-      <w:proofErr w:type="spellStart"/>
-      <w:r>
-        <w:t>vụ</w:t>
-      </w:r>
-      <w:proofErr w:type="spellEnd"/>
-      <w:r>
-        <w:t xml:space="preserve"> </w:t>
-      </w:r>
-      <w:proofErr w:type="spellStart"/>
-      <w:r>
-        <w:t>thực</w:t>
-      </w:r>
-      <w:proofErr w:type="spellEnd"/>
-      <w:r>
-        <w:t xml:space="preserve"> </w:t>
-      </w:r>
-      <w:proofErr w:type="spellStart"/>
-      <w:r>
-        <w:t>sự</w:t>
-      </w:r>
-      <w:proofErr w:type="spellEnd"/>
-      <w:r>
-        <w:t xml:space="preserve"> </w:t>
-      </w:r>
-      <w:proofErr w:type="spellStart"/>
-      <w:r>
-        <w:t>cần</w:t>
-      </w:r>
-      <w:proofErr w:type="spellEnd"/>
-      <w:r>
-        <w:t xml:space="preserve"> </w:t>
-      </w:r>
-      <w:proofErr w:type="spellStart"/>
-      <w:r>
-        <w:t>thiết</w:t>
-      </w:r>
-      <w:proofErr w:type="spellEnd"/>
-      <w:r>
-        <w:t xml:space="preserve">; </w:t>
-      </w:r>
-      <w:proofErr w:type="spellStart"/>
-      <w:r>
-        <w:t>tắt</w:t>
-      </w:r>
-      <w:proofErr w:type="spellEnd"/>
-      <w:r>
-        <w:t xml:space="preserve"> </w:t>
-      </w:r>
-      <w:proofErr w:type="spellStart"/>
-      <w:r>
-        <w:t>các</w:t>
-      </w:r>
-      <w:proofErr w:type="spellEnd"/>
-      <w:r>
-        <w:t xml:space="preserve"> </w:t>
-      </w:r>
-      <w:proofErr w:type="spellStart"/>
-      <w:r>
-        <w:t>dịch</w:t>
-      </w:r>
-      <w:proofErr w:type="spellEnd"/>
-      <w:r>
-        <w:t xml:space="preserve"> </w:t>
-      </w:r>
-      <w:proofErr w:type="spellStart"/>
-      <w:r>
-        <w:t>vụ</w:t>
-      </w:r>
-      <w:proofErr w:type="spellEnd"/>
-      <w:r>
-        <w:t xml:space="preserve"> </w:t>
-      </w:r>
-      <w:proofErr w:type="spellStart"/>
-      <w:r>
-        <w:t>quản</w:t>
-      </w:r>
-      <w:proofErr w:type="spellEnd"/>
-      <w:r>
-        <w:t xml:space="preserve"> </w:t>
-      </w:r>
-      <w:proofErr w:type="spellStart"/>
-      <w:r>
-        <w:t>trị</w:t>
-      </w:r>
-      <w:proofErr w:type="spellEnd"/>
-      <w:r>
-        <w:t xml:space="preserve"> </w:t>
-      </w:r>
-      <w:proofErr w:type="spellStart"/>
-      <w:r>
-        <w:t>từ</w:t>
-      </w:r>
-      <w:proofErr w:type="spellEnd"/>
-      <w:r>
-        <w:t xml:space="preserve"> WAN </w:t>
-      </w:r>
-      <w:proofErr w:type="spellStart"/>
-      <w:r>
-        <w:t>nếu</w:t>
-      </w:r>
-      <w:proofErr w:type="spellEnd"/>
-      <w:r>
-        <w:t xml:space="preserve"> </w:t>
-      </w:r>
-      <w:proofErr w:type="spellStart"/>
-      <w:r>
-        <w:t>không</w:t>
-      </w:r>
-      <w:proofErr w:type="spellEnd"/>
-      <w:r>
-        <w:t xml:space="preserve"> </w:t>
-      </w:r>
-      <w:proofErr w:type="spellStart"/>
-      <w:r>
-        <w:t>sử</w:t>
-      </w:r>
-      <w:proofErr w:type="spellEnd"/>
-      <w:r>
-        <w:t xml:space="preserve"> </w:t>
-      </w:r>
-      <w:proofErr w:type="spellStart"/>
-      <w:r>
-        <w:t>dụng</w:t>
-      </w:r>
-      <w:proofErr w:type="spellEnd"/>
-      <w:r>
-        <w:t xml:space="preserve">; </w:t>
-      </w:r>
-      <w:proofErr w:type="spellStart"/>
-      <w:r>
-        <w:t>bật</w:t>
-      </w:r>
-      <w:proofErr w:type="spellEnd"/>
-      <w:r>
-        <w:t xml:space="preserve"> logging </w:t>
-      </w:r>
-      <w:proofErr w:type="spellStart"/>
-      <w:r>
-        <w:t>để</w:t>
-      </w:r>
-      <w:proofErr w:type="spellEnd"/>
-      <w:r>
-        <w:t xml:space="preserve"> </w:t>
-      </w:r>
-      <w:proofErr w:type="spellStart"/>
-      <w:r>
-        <w:t>theo</w:t>
-      </w:r>
-      <w:proofErr w:type="spellEnd"/>
-      <w:r>
-        <w:t xml:space="preserve"> </w:t>
-      </w:r>
-      <w:proofErr w:type="spellStart"/>
-      <w:r>
-        <w:t>dõi</w:t>
-      </w:r>
-      <w:proofErr w:type="spellEnd"/>
-      <w:r>
-        <w:t xml:space="preserve"> </w:t>
-      </w:r>
-      <w:proofErr w:type="spellStart"/>
-      <w:r>
-        <w:t>các</w:t>
-      </w:r>
-      <w:proofErr w:type="spellEnd"/>
-      <w:r>
-        <w:t xml:space="preserve"> </w:t>
-      </w:r>
-      <w:proofErr w:type="spellStart"/>
-      <w:r>
-        <w:t>kết</w:t>
-      </w:r>
-      <w:proofErr w:type="spellEnd"/>
-      <w:r>
-        <w:t xml:space="preserve"> </w:t>
-      </w:r>
-      <w:proofErr w:type="spellStart"/>
-      <w:r>
-        <w:t>nối</w:t>
-      </w:r>
-      <w:proofErr w:type="spellEnd"/>
-      <w:r>
-        <w:t xml:space="preserve"> </w:t>
-      </w:r>
-      <w:proofErr w:type="spellStart"/>
-      <w:r>
-        <w:t>và</w:t>
-      </w:r>
-      <w:proofErr w:type="spellEnd"/>
-      <w:r>
-        <w:t xml:space="preserve"> </w:t>
-      </w:r>
-      <w:proofErr w:type="spellStart"/>
-      <w:r>
-        <w:t>hành</w:t>
-      </w:r>
-      <w:proofErr w:type="spellEnd"/>
-      <w:r>
-        <w:t xml:space="preserve"> vi </w:t>
-      </w:r>
-      <w:proofErr w:type="spellStart"/>
-      <w:r>
-        <w:t>bất</w:t>
-      </w:r>
-      <w:proofErr w:type="spellEnd"/>
-      <w:r>
-        <w:t xml:space="preserve"> </w:t>
-      </w:r>
-      <w:proofErr w:type="spellStart"/>
-      <w:r>
-        <w:t>thường</w:t>
-      </w:r>
-      <w:proofErr w:type="spellEnd"/>
-      <w:r>
-        <w:t>.</w:t>
+        <w:t>Trả lời:</w:t>
+      </w:r>
+      <w:r>
+        <w:t xml:space="preserve"> Có thể đổi mật khẩu mặc định của tài khoản admin thành mật khẩu mạnh; chỉ cho phép quản trị pfSense từ mạng LAN tin cậy; cập nhật pfSense thường xuyên; chỉ mở các port và dịch vụ thực sự cần thiết; tắt các dịch vụ quản trị từ WAN nếu không sử dụng; bật logging để theo dõi các kết nối và hành vi bất thường.</w:t>
       </w:r>
     </w:p>
     <w:p/>
     <w:sectPr>
-      <w:footerReference w:type="default" r:id="rId20"/>
+      <w:footerReference w:type="default" r:id="rId24"/>
       <w:pgSz w:w="12240" w:h="15840"/>
       <w:pgMar w:top="1134" w:right="1134" w:bottom="1134" w:left="1417" w:header="720" w:footer="720" w:gutter="0"/>
       <w:cols w:space="720"/>
@@ -7604,6 +4135,7 @@
   <w:style w:type="character" w:default="1" w:styleId="DefaultParagraphFont">
     <w:name w:val="Default Paragraph Font"/>
     <w:uiPriority w:val="1"/>
+    <w:semiHidden/>
     <w:unhideWhenUsed/>
   </w:style>
   <w:style w:type="table" w:default="1" w:styleId="TableNormal">

</xml_diff>